<commit_message>
Reorganize notebooks: rename to numbered format (01-06) and update project structure
</commit_message>
<xml_diff>
--- a/Rapport/1-Rapport_M2_AIDA_Final_Complet.docx
+++ b/Rapport/1-Rapport_M2_AIDA_Final_Complet.docx
@@ -189,13 +189,41 @@
         <w:ind w:left="0" w:right="59" w:firstLine="0"/>
         <w:jc w:val="center"/>
       </w:pPr>
+      <w:proofErr w:type="spellStart"/>
       <w:r>
         <w:rPr>
           <w:rFonts w:ascii="Calibri" w:eastAsia="Calibri" w:hAnsi="Calibri" w:cs="Calibri"/>
           <w:color w:val="17365D"/>
           <w:sz w:val="52"/>
         </w:rPr>
-        <w:t xml:space="preserve">scRNAseq analysis project : </w:t>
+        <w:t>scRNAseq</w:t>
+      </w:r>
+      <w:proofErr w:type="spellEnd"/>
+      <w:r>
+        <w:rPr>
+          <w:rFonts w:ascii="Calibri" w:eastAsia="Calibri" w:hAnsi="Calibri" w:cs="Calibri"/>
+          <w:color w:val="17365D"/>
+          <w:sz w:val="52"/>
+        </w:rPr>
+        <w:t xml:space="preserve"> </w:t>
+      </w:r>
+      <w:proofErr w:type="spellStart"/>
+      <w:r>
+        <w:rPr>
+          <w:rFonts w:ascii="Calibri" w:eastAsia="Calibri" w:hAnsi="Calibri" w:cs="Calibri"/>
+          <w:color w:val="17365D"/>
+          <w:sz w:val="52"/>
+        </w:rPr>
+        <w:t>analysis</w:t>
+      </w:r>
+      <w:proofErr w:type="spellEnd"/>
+      <w:r>
+        <w:rPr>
+          <w:rFonts w:ascii="Calibri" w:eastAsia="Calibri" w:hAnsi="Calibri" w:cs="Calibri"/>
+          <w:color w:val="17365D"/>
+          <w:sz w:val="52"/>
+        </w:rPr>
+        <w:t xml:space="preserve"> project : </w:t>
       </w:r>
     </w:p>
     <w:p>
@@ -345,21 +373,11 @@
     <w:p>
       <w:pPr>
         <w:spacing w:after="218" w:line="259" w:lineRule="auto"/>
-        <w:ind w:right="41"/>
-        <w:jc w:val="center"/>
-      </w:pPr>
-      <w:r>
-        <w:t xml:space="preserve">Yara DAGHER </w:t>
-      </w:r>
-    </w:p>
-    <w:p>
-      <w:pPr>
-        <w:spacing w:after="218" w:line="259" w:lineRule="auto"/>
         <w:ind w:right="40"/>
         <w:jc w:val="center"/>
       </w:pPr>
       <w:r>
-        <w:t xml:space="preserve">Elodie HUSSON </w:t>
+        <w:t xml:space="preserve"> </w:t>
       </w:r>
     </w:p>
     <w:p>
@@ -482,7 +500,23 @@
           <w:rFonts w:ascii="Century Gothic" w:eastAsia="Century Gothic" w:hAnsi="Century Gothic" w:cs="Century Gothic"/>
           <w:i/>
         </w:rPr>
-        <w:t xml:space="preserve">Master Artificial Intelligence and Data Analysis – AIDA </w:t>
+        <w:t xml:space="preserve">Master Artificial Intelligence and Data </w:t>
+      </w:r>
+      <w:proofErr w:type="spellStart"/>
+      <w:r>
+        <w:rPr>
+          <w:rFonts w:ascii="Century Gothic" w:eastAsia="Century Gothic" w:hAnsi="Century Gothic" w:cs="Century Gothic"/>
+          <w:i/>
+        </w:rPr>
+        <w:t>Analysis</w:t>
+      </w:r>
+      <w:proofErr w:type="spellEnd"/>
+      <w:r>
+        <w:rPr>
+          <w:rFonts w:ascii="Century Gothic" w:eastAsia="Century Gothic" w:hAnsi="Century Gothic" w:cs="Century Gothic"/>
+          <w:i/>
+        </w:rPr>
+        <w:t xml:space="preserve"> – AIDA </w:t>
       </w:r>
     </w:p>
     <w:p>
@@ -809,17 +843,908 @@
         <w:ind w:left="-5" w:right="35"/>
       </w:pPr>
       <w:r>
-        <w:t>Les données analysées proviennent de l'Atlas à l'échelle de la population des troubles croisés du cortex préfrontal humain (Lee et al., 2024), une ressource transcriptomique majeure accessible via le portail CellxGene Census (Chan Zuckerberg Initiative). Cet atlas initial profile plus de 6,3 millions de noyaux provenant de 1</w:t>
-      </w:r>
-      <w:r>
+        <w:t xml:space="preserve">Notre analyse repose sur le jeu de données issu de l'article scientifique intitulé </w:t>
+      </w:r>
+      <w:r>
+        <w:rPr>
+          <w:b/>
+          <w:bCs/>
+        </w:rPr>
+        <w:t>"Population-</w:t>
+      </w:r>
+      <w:proofErr w:type="spellStart"/>
+      <w:r>
+        <w:rPr>
+          <w:b/>
+          <w:bCs/>
+        </w:rPr>
+        <w:t>scale</w:t>
+      </w:r>
+      <w:proofErr w:type="spellEnd"/>
+      <w:r>
+        <w:rPr>
+          <w:b/>
+          <w:bCs/>
+        </w:rPr>
+        <w:t xml:space="preserve"> cross-</w:t>
+      </w:r>
+      <w:proofErr w:type="spellStart"/>
+      <w:r>
+        <w:rPr>
+          <w:b/>
+          <w:bCs/>
+        </w:rPr>
+        <w:t>disorder</w:t>
+      </w:r>
+      <w:proofErr w:type="spellEnd"/>
+      <w:r>
+        <w:rPr>
+          <w:b/>
+          <w:bCs/>
+        </w:rPr>
+        <w:t xml:space="preserve"> atlas of the </w:t>
+      </w:r>
+      <w:proofErr w:type="spellStart"/>
+      <w:r>
+        <w:rPr>
+          <w:b/>
+          <w:bCs/>
+        </w:rPr>
+        <w:t>human</w:t>
+      </w:r>
+      <w:proofErr w:type="spellEnd"/>
+      <w:r>
+        <w:rPr>
+          <w:b/>
+          <w:bCs/>
+        </w:rPr>
         <w:t xml:space="preserve"> </w:t>
       </w:r>
-      <w:r>
-        <w:t xml:space="preserve">494 donneurs post-mortem couvrant 26 diagnostics </w:t>
+      <w:proofErr w:type="spellStart"/>
+      <w:r>
+        <w:rPr>
+          <w:b/>
+          <w:bCs/>
+        </w:rPr>
+        <w:t>prefrontal</w:t>
+      </w:r>
+      <w:proofErr w:type="spellEnd"/>
+      <w:r>
+        <w:rPr>
+          <w:b/>
+          <w:bCs/>
+        </w:rPr>
+        <w:t xml:space="preserve"> cortex at single-cell </w:t>
+      </w:r>
+      <w:proofErr w:type="spellStart"/>
+      <w:r>
+        <w:rPr>
+          <w:b/>
+          <w:bCs/>
+        </w:rPr>
+        <w:t>resolution</w:t>
+      </w:r>
+      <w:proofErr w:type="spellEnd"/>
+      <w:r>
+        <w:rPr>
+          <w:b/>
+          <w:bCs/>
+        </w:rPr>
+        <w:t>"</w:t>
+      </w:r>
+      <w:r>
+        <w:t xml:space="preserve"> par </w:t>
+      </w:r>
+      <w:proofErr w:type="spellStart"/>
+      <w:r>
+        <w:t>Fullard</w:t>
+      </w:r>
+      <w:proofErr w:type="spellEnd"/>
+      <w:r>
+        <w:t xml:space="preserve"> et al. (2025) . Ce Data </w:t>
+      </w:r>
+      <w:proofErr w:type="spellStart"/>
+      <w:r>
+        <w:t>Descriptor</w:t>
+      </w:r>
+      <w:proofErr w:type="spellEnd"/>
+      <w:r>
+        <w:t xml:space="preserve"> présente</w:t>
+      </w:r>
+      <w:r>
+        <w:t xml:space="preserve"> une </w:t>
+      </w:r>
+      <w:r>
+        <w:t>ressource publique (</w:t>
+      </w:r>
+      <w:r>
+        <w:t xml:space="preserve">un </w:t>
+      </w:r>
+      <w:r>
+        <w:t>atlas multi-omique</w:t>
+      </w:r>
+      <w:r>
+        <w:t xml:space="preserve"> :</w:t>
+      </w:r>
+      <w:r>
+        <w:t xml:space="preserve"> génotype et snRNA-seq) englobant </w:t>
+      </w:r>
+      <w:r>
+        <w:rPr>
+          <w:b/>
+          <w:bCs/>
+        </w:rPr>
+        <w:t>plus de 6.3 millions de noyaux</w:t>
+      </w:r>
+      <w:r>
+        <w:t xml:space="preserve"> provenant de </w:t>
+      </w:r>
+      <w:r>
+        <w:rPr>
+          <w:b/>
+          <w:bCs/>
+        </w:rPr>
+        <w:t>1 494 donneurs</w:t>
+      </w:r>
+      <w:r>
+        <w:t xml:space="preserve">. Il constitue </w:t>
       </w:r>
       <w:r>
         <w:lastRenderedPageBreak/>
-        <w:t xml:space="preserve">neuropsychiatriques distincts. Pour cette étude, nous avons extrait une cohorte ciblée et rigoureusement filtrée de 62 800 noyaux provenant de 17 donneurs, incluant 8 patients atteints de la maladie d'Alzheimer (AD), 3 patients atteints de la maladie de Parkinson (PD) et 6 contrôles neurotypiques (CTRL). Cette réduction drastique a été motivée par des contraintes de pureté analytique (exclusion des comorbidités) et des limitations matérielles (RAM disponible). </w:t>
+        <w:t xml:space="preserve">notre </w:t>
+      </w:r>
+      <w:r>
+        <w:t>source des métadonnées et des critères de Contrôle Qualité (QC) utilisés dans notre pipeline d'analyse.</w:t>
+      </w:r>
+    </w:p>
+    <w:p>
+      <w:pPr>
+        <w:spacing w:after="0" w:line="240" w:lineRule="auto"/>
+        <w:ind w:left="-5" w:right="35"/>
+      </w:pPr>
+    </w:p>
+    <w:p>
+      <w:pPr>
+        <w:spacing w:after="0" w:line="240" w:lineRule="auto"/>
+        <w:ind w:left="-5" w:right="35"/>
+      </w:pPr>
+      <w:r>
+        <w:t xml:space="preserve">Le jeu de données initial de l'atlas croisé des troubles du cortex préfrontal humain est une ressource massive de plus de 6 millions de noyaux, totalisant environ 34 Go. Pour des raisons </w:t>
+      </w:r>
+      <w:r>
+        <w:rPr>
+          <w:b/>
+          <w:bCs/>
+        </w:rPr>
+        <w:t>techniques et pratiques</w:t>
+      </w:r>
+      <w:r>
+        <w:t xml:space="preserve"> (contraintes de mémoire vive et de temps de traitement), il n'était pas possible d'analyser cette matrice brute complète. Nous avons donc fait le choix stratégique de nous concentrer sur la </w:t>
+      </w:r>
+      <w:proofErr w:type="spellStart"/>
+      <w:r>
+        <w:rPr>
+          <w:b/>
+          <w:bCs/>
+        </w:rPr>
+        <w:t>HBCC_Cohort</w:t>
+      </w:r>
+      <w:proofErr w:type="spellEnd"/>
+      <w:r>
+        <w:rPr>
+          <w:b/>
+          <w:bCs/>
+        </w:rPr>
+        <w:t xml:space="preserve"> (Human Brain Collection Center)</w:t>
+      </w:r>
+      <w:r>
+        <w:t xml:space="preserve">, un sous-ensemble gérable d'environ </w:t>
+      </w:r>
+      <w:r>
+        <w:rPr>
+          <w:b/>
+          <w:bCs/>
+        </w:rPr>
+        <w:t>1,5 million de noyaux</w:t>
+      </w:r>
+      <w:r>
+        <w:t xml:space="preserve">. Ce volume est amplement suffisant pour garantir la </w:t>
+      </w:r>
+      <w:r>
+        <w:rPr>
+          <w:b/>
+          <w:bCs/>
+        </w:rPr>
+        <w:t>puissance statistique</w:t>
+      </w:r>
+      <w:r>
+        <w:t xml:space="preserve"> requise pour l'intégralité de la </w:t>
+      </w:r>
+      <w:r>
+        <w:rPr>
+          <w:i/>
+          <w:iCs/>
+        </w:rPr>
+        <w:t>pipeline</w:t>
+      </w:r>
+      <w:r>
+        <w:t xml:space="preserve"> d'analyse (Contrôle Qualité, </w:t>
+      </w:r>
+      <w:r>
+        <w:rPr>
+          <w:i/>
+          <w:iCs/>
+        </w:rPr>
+        <w:t>clustering</w:t>
+      </w:r>
+      <w:r>
+        <w:t>, et analyse d'expression différentielle), tout en assurant la faisabilité et la reproductibilité du projet</w:t>
+      </w:r>
+    </w:p>
+    <w:p>
+      <w:pPr>
+        <w:spacing w:after="0" w:line="240" w:lineRule="auto"/>
+        <w:ind w:left="-5" w:right="35"/>
+      </w:pPr>
+    </w:p>
+    <w:p>
+      <w:pPr>
+        <w:numPr>
+          <w:ilvl w:val="0"/>
+          <w:numId w:val="29"/>
+        </w:numPr>
+        <w:ind w:right="35"/>
+        <w:rPr>
+          <w:b/>
+        </w:rPr>
+      </w:pPr>
+      <w:r>
+        <w:rPr>
+          <w:b/>
+        </w:rPr>
+        <w:t>Note Importante pour l'Exploration des Données (EDA)</w:t>
+      </w:r>
+    </w:p>
+    <w:tbl>
+      <w:tblPr>
+        <w:tblW w:w="0" w:type="auto"/>
+        <w:tblCellMar>
+          <w:top w:w="15" w:type="dxa"/>
+          <w:left w:w="15" w:type="dxa"/>
+          <w:right w:w="15" w:type="dxa"/>
+        </w:tblCellMar>
+        <w:tblLook w:val="04A0" w:firstRow="1" w:lastRow="0" w:firstColumn="1" w:lastColumn="0" w:noHBand="0" w:noVBand="1"/>
+      </w:tblPr>
+      <w:tblGrid>
+        <w:gridCol w:w="1821"/>
+        <w:gridCol w:w="3298"/>
+        <w:gridCol w:w="4311"/>
+      </w:tblGrid>
+      <w:tr>
+        <w:trPr>
+          <w:tblHeader/>
+        </w:trPr>
+        <w:tc>
+          <w:tcPr>
+            <w:tcW w:w="0" w:type="auto"/>
+            <w:tcBorders>
+              <w:top w:val="single" w:sz="6" w:space="0" w:color="auto"/>
+              <w:left w:val="single" w:sz="6" w:space="0" w:color="auto"/>
+              <w:bottom w:val="single" w:sz="6" w:space="0" w:color="auto"/>
+              <w:right w:val="single" w:sz="6" w:space="0" w:color="auto"/>
+            </w:tcBorders>
+            <w:tcMar>
+              <w:top w:w="75" w:type="dxa"/>
+              <w:left w:w="150" w:type="dxa"/>
+              <w:bottom w:w="75" w:type="dxa"/>
+              <w:right w:w="150" w:type="dxa"/>
+            </w:tcMar>
+            <w:vAlign w:val="center"/>
+            <w:hideMark/>
+          </w:tcPr>
+          <w:p>
+            <w:pPr>
+              <w:spacing w:after="0" w:line="240" w:lineRule="auto"/>
+              <w:ind w:left="-5" w:right="35"/>
+              <w:rPr>
+                <w:b/>
+                <w:bCs/>
+              </w:rPr>
+            </w:pPr>
+            <w:r>
+              <w:rPr>
+                <w:b/>
+                <w:bCs/>
+              </w:rPr>
+              <w:t>Concept Clé</w:t>
+            </w:r>
+          </w:p>
+        </w:tc>
+        <w:tc>
+          <w:tcPr>
+            <w:tcW w:w="0" w:type="auto"/>
+            <w:tcBorders>
+              <w:top w:val="single" w:sz="6" w:space="0" w:color="auto"/>
+              <w:left w:val="single" w:sz="6" w:space="0" w:color="auto"/>
+              <w:bottom w:val="single" w:sz="6" w:space="0" w:color="auto"/>
+              <w:right w:val="single" w:sz="6" w:space="0" w:color="auto"/>
+            </w:tcBorders>
+            <w:tcMar>
+              <w:top w:w="75" w:type="dxa"/>
+              <w:left w:w="150" w:type="dxa"/>
+              <w:bottom w:w="75" w:type="dxa"/>
+              <w:right w:w="150" w:type="dxa"/>
+            </w:tcMar>
+            <w:vAlign w:val="center"/>
+            <w:hideMark/>
+          </w:tcPr>
+          <w:p>
+            <w:pPr>
+              <w:spacing w:after="0" w:line="240" w:lineRule="auto"/>
+              <w:ind w:left="-5" w:right="35"/>
+              <w:rPr>
+                <w:b/>
+                <w:bCs/>
+              </w:rPr>
+            </w:pPr>
+            <w:r>
+              <w:rPr>
+                <w:b/>
+                <w:bCs/>
+              </w:rPr>
+              <w:t>Champs et Objectif</w:t>
+            </w:r>
+          </w:p>
+        </w:tc>
+        <w:tc>
+          <w:tcPr>
+            <w:tcW w:w="0" w:type="auto"/>
+            <w:tcBorders>
+              <w:top w:val="single" w:sz="6" w:space="0" w:color="auto"/>
+              <w:left w:val="single" w:sz="6" w:space="0" w:color="auto"/>
+              <w:bottom w:val="single" w:sz="6" w:space="0" w:color="auto"/>
+              <w:right w:val="single" w:sz="6" w:space="0" w:color="auto"/>
+            </w:tcBorders>
+            <w:tcMar>
+              <w:top w:w="75" w:type="dxa"/>
+              <w:left w:w="150" w:type="dxa"/>
+              <w:bottom w:w="75" w:type="dxa"/>
+              <w:right w:w="150" w:type="dxa"/>
+            </w:tcMar>
+            <w:vAlign w:val="center"/>
+            <w:hideMark/>
+          </w:tcPr>
+          <w:p>
+            <w:pPr>
+              <w:spacing w:after="0" w:line="240" w:lineRule="auto"/>
+              <w:ind w:left="-5" w:right="35"/>
+              <w:rPr>
+                <w:b/>
+                <w:bCs/>
+              </w:rPr>
+            </w:pPr>
+            <w:r>
+              <w:rPr>
+                <w:b/>
+                <w:bCs/>
+              </w:rPr>
+              <w:t>Rôle dans l'EDA/Pipeline</w:t>
+            </w:r>
+          </w:p>
+        </w:tc>
+      </w:tr>
+      <w:tr>
+        <w:tc>
+          <w:tcPr>
+            <w:tcW w:w="0" w:type="auto"/>
+            <w:tcBorders>
+              <w:top w:val="single" w:sz="6" w:space="0" w:color="auto"/>
+              <w:left w:val="single" w:sz="6" w:space="0" w:color="auto"/>
+              <w:bottom w:val="single" w:sz="6" w:space="0" w:color="auto"/>
+              <w:right w:val="single" w:sz="6" w:space="0" w:color="auto"/>
+            </w:tcBorders>
+            <w:tcMar>
+              <w:top w:w="75" w:type="dxa"/>
+              <w:left w:w="150" w:type="dxa"/>
+              <w:bottom w:w="75" w:type="dxa"/>
+              <w:right w:w="150" w:type="dxa"/>
+            </w:tcMar>
+            <w:vAlign w:val="center"/>
+            <w:hideMark/>
+          </w:tcPr>
+          <w:p>
+            <w:pPr>
+              <w:spacing w:after="0" w:line="240" w:lineRule="auto"/>
+              <w:ind w:left="-5" w:right="35"/>
+            </w:pPr>
+            <w:r>
+              <w:rPr>
+                <w:b/>
+                <w:bCs/>
+              </w:rPr>
+              <w:t>Sélection Clinique</w:t>
+            </w:r>
+          </w:p>
+        </w:tc>
+        <w:tc>
+          <w:tcPr>
+            <w:tcW w:w="0" w:type="auto"/>
+            <w:tcBorders>
+              <w:top w:val="single" w:sz="6" w:space="0" w:color="auto"/>
+              <w:left w:val="single" w:sz="6" w:space="0" w:color="auto"/>
+              <w:bottom w:val="single" w:sz="6" w:space="0" w:color="auto"/>
+              <w:right w:val="single" w:sz="6" w:space="0" w:color="auto"/>
+            </w:tcBorders>
+            <w:tcMar>
+              <w:top w:w="75" w:type="dxa"/>
+              <w:left w:w="150" w:type="dxa"/>
+              <w:bottom w:w="75" w:type="dxa"/>
+              <w:right w:w="150" w:type="dxa"/>
+            </w:tcMar>
+            <w:vAlign w:val="center"/>
+            <w:hideMark/>
+          </w:tcPr>
+          <w:p>
+            <w:pPr>
+              <w:spacing w:after="0" w:line="240" w:lineRule="auto"/>
+              <w:ind w:left="-5" w:right="35"/>
+              <w:rPr>
+                <w:lang w:val="en-US"/>
+              </w:rPr>
+            </w:pPr>
+            <w:proofErr w:type="spellStart"/>
+            <w:r>
+              <w:rPr>
+                <w:lang w:val="en-US"/>
+              </w:rPr>
+              <w:t>AD_status</w:t>
+            </w:r>
+            <w:proofErr w:type="spellEnd"/>
+            <w:r>
+              <w:rPr>
+                <w:lang w:val="en-US"/>
+              </w:rPr>
+              <w:t> à </w:t>
+            </w:r>
+            <w:proofErr w:type="spellStart"/>
+            <w:r>
+              <w:rPr>
+                <w:lang w:val="en-US"/>
+              </w:rPr>
+              <w:t>Vascular_status</w:t>
+            </w:r>
+            <w:proofErr w:type="spellEnd"/>
+          </w:p>
+        </w:tc>
+        <w:tc>
+          <w:tcPr>
+            <w:tcW w:w="0" w:type="auto"/>
+            <w:tcBorders>
+              <w:top w:val="single" w:sz="6" w:space="0" w:color="auto"/>
+              <w:left w:val="single" w:sz="6" w:space="0" w:color="auto"/>
+              <w:bottom w:val="single" w:sz="6" w:space="0" w:color="auto"/>
+              <w:right w:val="single" w:sz="6" w:space="0" w:color="auto"/>
+            </w:tcBorders>
+            <w:tcMar>
+              <w:top w:w="75" w:type="dxa"/>
+              <w:left w:w="150" w:type="dxa"/>
+              <w:bottom w:w="75" w:type="dxa"/>
+              <w:right w:w="150" w:type="dxa"/>
+            </w:tcMar>
+            <w:vAlign w:val="center"/>
+            <w:hideMark/>
+          </w:tcPr>
+          <w:p>
+            <w:pPr>
+              <w:spacing w:after="0" w:line="240" w:lineRule="auto"/>
+              <w:ind w:left="-5" w:right="35"/>
+            </w:pPr>
+            <w:r>
+              <w:t>Ces diagnostics bruts doivent être filtrés pour définir un groupe cible </w:t>
+            </w:r>
+            <w:r>
+              <w:rPr>
+                <w:b/>
+                <w:bCs/>
+              </w:rPr>
+              <w:t>cliniquement pur</w:t>
+            </w:r>
+            <w:r>
+              <w:t> (exclusion des comorbidités) pour la DGE.</w:t>
+            </w:r>
+          </w:p>
+        </w:tc>
+      </w:tr>
+      <w:tr>
+        <w:tc>
+          <w:tcPr>
+            <w:tcW w:w="0" w:type="auto"/>
+            <w:tcBorders>
+              <w:top w:val="single" w:sz="6" w:space="0" w:color="auto"/>
+              <w:left w:val="single" w:sz="6" w:space="0" w:color="auto"/>
+              <w:bottom w:val="single" w:sz="6" w:space="0" w:color="auto"/>
+              <w:right w:val="single" w:sz="6" w:space="0" w:color="auto"/>
+            </w:tcBorders>
+            <w:tcMar>
+              <w:top w:w="75" w:type="dxa"/>
+              <w:left w:w="150" w:type="dxa"/>
+              <w:bottom w:w="75" w:type="dxa"/>
+              <w:right w:w="150" w:type="dxa"/>
+            </w:tcMar>
+            <w:vAlign w:val="center"/>
+            <w:hideMark/>
+          </w:tcPr>
+          <w:p>
+            <w:pPr>
+              <w:spacing w:after="0" w:line="240" w:lineRule="auto"/>
+              <w:ind w:left="-5" w:right="35"/>
+            </w:pPr>
+            <w:r>
+              <w:rPr>
+                <w:b/>
+                <w:bCs/>
+              </w:rPr>
+              <w:t>Contrôle Qualité (QC)</w:t>
+            </w:r>
+          </w:p>
+        </w:tc>
+        <w:tc>
+          <w:tcPr>
+            <w:tcW w:w="0" w:type="auto"/>
+            <w:tcBorders>
+              <w:top w:val="single" w:sz="6" w:space="0" w:color="auto"/>
+              <w:left w:val="single" w:sz="6" w:space="0" w:color="auto"/>
+              <w:bottom w:val="single" w:sz="6" w:space="0" w:color="auto"/>
+              <w:right w:val="single" w:sz="6" w:space="0" w:color="auto"/>
+            </w:tcBorders>
+            <w:tcMar>
+              <w:top w:w="75" w:type="dxa"/>
+              <w:left w:w="150" w:type="dxa"/>
+              <w:bottom w:w="75" w:type="dxa"/>
+              <w:right w:w="150" w:type="dxa"/>
+            </w:tcMar>
+            <w:vAlign w:val="center"/>
+            <w:hideMark/>
+          </w:tcPr>
+          <w:p>
+            <w:pPr>
+              <w:spacing w:after="0" w:line="240" w:lineRule="auto"/>
+              <w:ind w:left="-5" w:right="35"/>
+            </w:pPr>
+            <w:proofErr w:type="spellStart"/>
+            <w:r>
+              <w:t>n_counts</w:t>
+            </w:r>
+            <w:proofErr w:type="spellEnd"/>
+            <w:r>
+              <w:t> (Total UMI) &amp; n_genes (Gènes détectés)</w:t>
+            </w:r>
+          </w:p>
+        </w:tc>
+        <w:tc>
+          <w:tcPr>
+            <w:tcW w:w="0" w:type="auto"/>
+            <w:tcBorders>
+              <w:top w:val="single" w:sz="6" w:space="0" w:color="auto"/>
+              <w:left w:val="single" w:sz="6" w:space="0" w:color="auto"/>
+              <w:bottom w:val="single" w:sz="6" w:space="0" w:color="auto"/>
+              <w:right w:val="single" w:sz="6" w:space="0" w:color="auto"/>
+            </w:tcBorders>
+            <w:tcMar>
+              <w:top w:w="75" w:type="dxa"/>
+              <w:left w:w="150" w:type="dxa"/>
+              <w:bottom w:w="75" w:type="dxa"/>
+              <w:right w:w="150" w:type="dxa"/>
+            </w:tcMar>
+            <w:vAlign w:val="center"/>
+            <w:hideMark/>
+          </w:tcPr>
+          <w:p>
+            <w:pPr>
+              <w:spacing w:after="0" w:line="240" w:lineRule="auto"/>
+              <w:ind w:left="-5" w:right="35"/>
+            </w:pPr>
+            <w:r>
+              <w:t>Champs cruciaux pour la normalisation et l'identification des artefacts (cellules mortes ou doublets).</w:t>
+            </w:r>
+          </w:p>
+        </w:tc>
+      </w:tr>
+      <w:tr>
+        <w:tc>
+          <w:tcPr>
+            <w:tcW w:w="0" w:type="auto"/>
+            <w:tcBorders>
+              <w:top w:val="single" w:sz="6" w:space="0" w:color="auto"/>
+              <w:left w:val="single" w:sz="6" w:space="0" w:color="auto"/>
+              <w:bottom w:val="single" w:sz="6" w:space="0" w:color="auto"/>
+              <w:right w:val="single" w:sz="6" w:space="0" w:color="auto"/>
+            </w:tcBorders>
+            <w:tcMar>
+              <w:top w:w="75" w:type="dxa"/>
+              <w:left w:w="150" w:type="dxa"/>
+              <w:bottom w:w="75" w:type="dxa"/>
+              <w:right w:w="150" w:type="dxa"/>
+            </w:tcMar>
+            <w:vAlign w:val="center"/>
+            <w:hideMark/>
+          </w:tcPr>
+          <w:p>
+            <w:pPr>
+              <w:spacing w:after="0" w:line="240" w:lineRule="auto"/>
+              <w:ind w:left="-5" w:right="35"/>
+            </w:pPr>
+            <w:r>
+              <w:rPr>
+                <w:b/>
+                <w:bCs/>
+              </w:rPr>
+              <w:t>Annotation</w:t>
+            </w:r>
+          </w:p>
+        </w:tc>
+        <w:tc>
+          <w:tcPr>
+            <w:tcW w:w="0" w:type="auto"/>
+            <w:tcBorders>
+              <w:top w:val="single" w:sz="6" w:space="0" w:color="auto"/>
+              <w:left w:val="single" w:sz="6" w:space="0" w:color="auto"/>
+              <w:bottom w:val="single" w:sz="6" w:space="0" w:color="auto"/>
+              <w:right w:val="single" w:sz="6" w:space="0" w:color="auto"/>
+            </w:tcBorders>
+            <w:tcMar>
+              <w:top w:w="75" w:type="dxa"/>
+              <w:left w:w="150" w:type="dxa"/>
+              <w:bottom w:w="75" w:type="dxa"/>
+              <w:right w:w="150" w:type="dxa"/>
+            </w:tcMar>
+            <w:vAlign w:val="center"/>
+            <w:hideMark/>
+          </w:tcPr>
+          <w:p>
+            <w:pPr>
+              <w:spacing w:after="0" w:line="240" w:lineRule="auto"/>
+              <w:ind w:left="-5" w:right="35"/>
+            </w:pPr>
+            <w:proofErr w:type="spellStart"/>
+            <w:r>
+              <w:t>gene_name</w:t>
+            </w:r>
+            <w:proofErr w:type="spellEnd"/>
+            <w:r>
+              <w:t> (dans .var) &amp; </w:t>
+            </w:r>
+            <w:proofErr w:type="spellStart"/>
+            <w:r>
+              <w:t>cell_type</w:t>
+            </w:r>
+            <w:proofErr w:type="spellEnd"/>
+            <w:r>
+              <w:t> (dans .</w:t>
+            </w:r>
+            <w:proofErr w:type="spellStart"/>
+            <w:r>
+              <w:t>obs</w:t>
+            </w:r>
+            <w:proofErr w:type="spellEnd"/>
+            <w:r>
+              <w:t>)</w:t>
+            </w:r>
+          </w:p>
+        </w:tc>
+        <w:tc>
+          <w:tcPr>
+            <w:tcW w:w="0" w:type="auto"/>
+            <w:tcBorders>
+              <w:top w:val="single" w:sz="6" w:space="0" w:color="auto"/>
+              <w:left w:val="single" w:sz="6" w:space="0" w:color="auto"/>
+              <w:bottom w:val="single" w:sz="6" w:space="0" w:color="auto"/>
+              <w:right w:val="single" w:sz="6" w:space="0" w:color="auto"/>
+            </w:tcBorders>
+            <w:tcMar>
+              <w:top w:w="75" w:type="dxa"/>
+              <w:left w:w="150" w:type="dxa"/>
+              <w:bottom w:w="75" w:type="dxa"/>
+              <w:right w:w="150" w:type="dxa"/>
+            </w:tcMar>
+            <w:vAlign w:val="center"/>
+            <w:hideMark/>
+          </w:tcPr>
+          <w:p>
+            <w:pPr>
+              <w:spacing w:after="0" w:line="240" w:lineRule="auto"/>
+              <w:ind w:left="-5" w:right="35"/>
+            </w:pPr>
+            <w:r>
+              <w:t>Le </w:t>
+            </w:r>
+            <w:proofErr w:type="spellStart"/>
+            <w:r>
+              <w:t>gene_name</w:t>
+            </w:r>
+            <w:proofErr w:type="spellEnd"/>
+            <w:r>
+              <w:t> est l'identifiant lisible pour l'analyse ORA. Le </w:t>
+            </w:r>
+            <w:proofErr w:type="spellStart"/>
+            <w:r>
+              <w:t>cell_type</w:t>
+            </w:r>
+            <w:proofErr w:type="spellEnd"/>
+            <w:r>
+              <w:t xml:space="preserve"> est la base de votre comparaison cellulaire (ex: </w:t>
+            </w:r>
+            <w:proofErr w:type="spellStart"/>
+            <w:r>
+              <w:t>Microglia</w:t>
+            </w:r>
+            <w:proofErr w:type="spellEnd"/>
+            <w:r>
+              <w:t xml:space="preserve"> vs. Astrocyte).</w:t>
+            </w:r>
+          </w:p>
+        </w:tc>
+      </w:tr>
+      <w:tr>
+        <w:tc>
+          <w:tcPr>
+            <w:tcW w:w="0" w:type="auto"/>
+            <w:tcBorders>
+              <w:top w:val="single" w:sz="6" w:space="0" w:color="auto"/>
+              <w:left w:val="single" w:sz="6" w:space="0" w:color="auto"/>
+              <w:bottom w:val="single" w:sz="6" w:space="0" w:color="auto"/>
+              <w:right w:val="single" w:sz="6" w:space="0" w:color="auto"/>
+            </w:tcBorders>
+            <w:tcMar>
+              <w:top w:w="75" w:type="dxa"/>
+              <w:left w:w="150" w:type="dxa"/>
+              <w:bottom w:w="75" w:type="dxa"/>
+              <w:right w:w="150" w:type="dxa"/>
+            </w:tcMar>
+            <w:vAlign w:val="center"/>
+            <w:hideMark/>
+          </w:tcPr>
+          <w:p>
+            <w:pPr>
+              <w:spacing w:after="0" w:line="240" w:lineRule="auto"/>
+              <w:ind w:left="-5" w:right="35"/>
+            </w:pPr>
+            <w:r>
+              <w:rPr>
+                <w:b/>
+                <w:bCs/>
+              </w:rPr>
+              <w:t>Identification</w:t>
+            </w:r>
+          </w:p>
+        </w:tc>
+        <w:tc>
+          <w:tcPr>
+            <w:tcW w:w="0" w:type="auto"/>
+            <w:tcBorders>
+              <w:top w:val="single" w:sz="6" w:space="0" w:color="auto"/>
+              <w:left w:val="single" w:sz="6" w:space="0" w:color="auto"/>
+              <w:bottom w:val="single" w:sz="6" w:space="0" w:color="auto"/>
+              <w:right w:val="single" w:sz="6" w:space="0" w:color="auto"/>
+            </w:tcBorders>
+            <w:tcMar>
+              <w:top w:w="75" w:type="dxa"/>
+              <w:left w:w="150" w:type="dxa"/>
+              <w:bottom w:w="75" w:type="dxa"/>
+              <w:right w:w="150" w:type="dxa"/>
+            </w:tcMar>
+            <w:vAlign w:val="center"/>
+            <w:hideMark/>
+          </w:tcPr>
+          <w:p>
+            <w:pPr>
+              <w:spacing w:after="0" w:line="240" w:lineRule="auto"/>
+              <w:ind w:left="-5" w:right="35"/>
+            </w:pPr>
+            <w:r>
+              <w:t>Index du .var (souvent ENSEMBL)</w:t>
+            </w:r>
+          </w:p>
+        </w:tc>
+        <w:tc>
+          <w:tcPr>
+            <w:tcW w:w="0" w:type="auto"/>
+            <w:tcBorders>
+              <w:top w:val="single" w:sz="6" w:space="0" w:color="auto"/>
+              <w:left w:val="single" w:sz="6" w:space="0" w:color="auto"/>
+              <w:bottom w:val="single" w:sz="6" w:space="0" w:color="auto"/>
+              <w:right w:val="single" w:sz="6" w:space="0" w:color="auto"/>
+            </w:tcBorders>
+            <w:tcMar>
+              <w:top w:w="75" w:type="dxa"/>
+              <w:left w:w="150" w:type="dxa"/>
+              <w:bottom w:w="75" w:type="dxa"/>
+              <w:right w:w="150" w:type="dxa"/>
+            </w:tcMar>
+            <w:vAlign w:val="center"/>
+            <w:hideMark/>
+          </w:tcPr>
+          <w:p>
+            <w:pPr>
+              <w:spacing w:after="0" w:line="240" w:lineRule="auto"/>
+              <w:ind w:left="-5" w:right="35"/>
+            </w:pPr>
+            <w:r>
+              <w:t>Utilisé par les outils R comme </w:t>
+            </w:r>
+            <w:r>
+              <w:rPr>
+                <w:b/>
+                <w:bCs/>
+              </w:rPr>
+              <w:t>clusterProfiler</w:t>
+            </w:r>
+            <w:r>
+              <w:t> pour l'analyse d'enrichissement (Figure 5).</w:t>
+            </w:r>
+          </w:p>
+        </w:tc>
+      </w:tr>
+    </w:tbl>
+    <w:p>
+      <w:pPr>
+        <w:spacing w:after="0" w:line="240" w:lineRule="auto"/>
+        <w:ind w:left="-5" w:right="35"/>
+      </w:pPr>
+    </w:p>
+    <w:p>
+      <w:pPr>
+        <w:spacing w:after="0" w:line="240" w:lineRule="auto"/>
+        <w:ind w:left="-5" w:right="35"/>
+      </w:pPr>
+    </w:p>
+    <w:p>
+      <w:pPr>
+        <w:spacing w:after="0" w:line="240" w:lineRule="auto"/>
+        <w:ind w:left="-5" w:right="35"/>
+      </w:pPr>
+    </w:p>
+    <w:p>
+      <w:pPr>
+        <w:spacing w:after="0" w:line="240" w:lineRule="auto"/>
+        <w:ind w:left="-5" w:right="35"/>
+      </w:pPr>
+    </w:p>
+    <w:p>
+      <w:pPr>
+        <w:spacing w:after="0" w:line="240" w:lineRule="auto"/>
+        <w:ind w:left="-5" w:right="35"/>
+      </w:pPr>
+    </w:p>
+    <w:p>
+      <w:pPr>
+        <w:spacing w:after="0" w:line="240" w:lineRule="auto"/>
+        <w:ind w:left="-5" w:right="35"/>
+      </w:pPr>
+      <w:r>
+        <w:t xml:space="preserve">Les données analysées proviennent de l'Atlas à l'échelle de la population des troubles croisés du cortex préfrontal humain (Lee et al., 2024), une ressource transcriptomique majeure accessible via le portail </w:t>
+      </w:r>
+      <w:proofErr w:type="spellStart"/>
+      <w:r>
+        <w:t>CellxGene</w:t>
+      </w:r>
+      <w:proofErr w:type="spellEnd"/>
+      <w:r>
+        <w:t xml:space="preserve"> </w:t>
+      </w:r>
+      <w:proofErr w:type="spellStart"/>
+      <w:r>
+        <w:t>Census</w:t>
+      </w:r>
+      <w:proofErr w:type="spellEnd"/>
+      <w:r>
+        <w:t xml:space="preserve"> (Chan Zuckerberg Initiative). Cet atlas initial profile plus de 6,3 millions de noyaux provenant de 1</w:t>
+      </w:r>
+      <w:r>
+        <w:t xml:space="preserve"> </w:t>
+      </w:r>
+      <w:r>
+        <w:t xml:space="preserve">494 donneurs post-mortem couvrant 26 diagnostics neuropsychiatriques distincts. Pour cette étude, nous avons extrait une cohorte ciblée et rigoureusement filtrée de 62 800 noyaux provenant de 17 donneurs, incluant 8 patients atteints de la maladie d'Alzheimer (AD), 3 patients atteints de la maladie de Parkinson (PD) et 6 contrôles neurotypiques (CTRL). Cette réduction drastique a été motivée par des contraintes de pureté analytique (exclusion des comorbidités) et des limitations matérielles (RAM disponible). </w:t>
       </w:r>
     </w:p>
     <w:p>
@@ -859,6 +1784,7 @@
         <w:rPr>
           <w:noProof/>
         </w:rPr>
+        <w:lastRenderedPageBreak/>
         <w:drawing>
           <wp:anchor distT="0" distB="0" distL="114300" distR="114300" simplePos="0" relativeHeight="251658240" behindDoc="0" locked="0" layoutInCell="1" allowOverlap="1" wp14:anchorId="6640545C" wp14:editId="6C3E5071">
             <wp:simplePos x="0" y="0"/>
@@ -1004,7 +1930,25 @@
           <w:color w:val="666666"/>
           <w:sz w:val="18"/>
         </w:rPr>
-        <w:t xml:space="preserve">Lecture en mode backed ('r') </w:t>
+        <w:t>Lecture en mode backed ('</w:t>
+      </w:r>
+      <w:proofErr w:type="spellStart"/>
+      <w:r>
+        <w:rPr>
+          <w:rFonts w:ascii="Century Gothic" w:eastAsia="Century Gothic" w:hAnsi="Century Gothic" w:cs="Century Gothic"/>
+          <w:color w:val="666666"/>
+          <w:sz w:val="18"/>
+        </w:rPr>
+        <w:t>r'</w:t>
+      </w:r>
+      <w:proofErr w:type="spellEnd"/>
+      <w:r>
+        <w:rPr>
+          <w:rFonts w:ascii="Century Gothic" w:eastAsia="Century Gothic" w:hAnsi="Century Gothic" w:cs="Century Gothic"/>
+          <w:color w:val="666666"/>
+          <w:sz w:val="18"/>
+        </w:rPr>
+        <w:t xml:space="preserve">) </w:t>
       </w:r>
       <w:r>
         <w:rPr>
@@ -1520,11 +2464,7 @@
         <w:ind w:left="-15" w:right="0" w:firstLine="0"/>
       </w:pPr>
       <w:r>
-        <w:t xml:space="preserve">La question biologique centrale de ce projet est : « Quelles sont les signatures transcriptomiques cellulaires communes et spécifiques partagées entre la maladie d'Alzheimer (AD) et la maladie de </w:t>
-      </w:r>
-      <w:r>
-        <w:lastRenderedPageBreak/>
-        <w:t>Parkinson (PD) au niveau du cortex préfrontal dorsolatéral, et comment le sexe biologique module-t-il ces signatures ? »</w:t>
+        <w:t>La question biologique centrale de ce projet est : « Quelles sont les signatures transcriptomiques cellulaires communes et spécifiques partagées entre la maladie d'Alzheimer (AD) et la maladie de Parkinson (PD) au niveau du cortex préfrontal dorsolatéral, et comment le sexe biologique module-t-il ces signatures ? »</w:t>
       </w:r>
     </w:p>
     <w:p>
@@ -1559,6 +2499,7 @@
         <w:ind w:right="35" w:hanging="296"/>
       </w:pPr>
       <w:r>
+        <w:lastRenderedPageBreak/>
         <w:t>Détecter les gènes différentiellement exprimés (DEGs) dans chaque type cellulaire, en comparant AD vs CTRL et PD vs CTRL, tout en contrôlant les facteurs confondants (sexe, ascendance génétique).</w:t>
       </w:r>
     </w:p>
@@ -1612,6 +2553,7 @@
       <w:r>
         <w:t xml:space="preserve">Le pipeline analytique a été structuré en 4 notebooks </w:t>
       </w:r>
+      <w:proofErr w:type="spellStart"/>
       <w:r>
         <w:rPr>
           <w:i/>
@@ -1619,6 +2561,7 @@
         </w:rPr>
         <w:t>Jupyter</w:t>
       </w:r>
+      <w:proofErr w:type="spellEnd"/>
       <w:r>
         <w:t xml:space="preserve"> modulaires et séquentiels</w:t>
       </w:r>
@@ -1792,7 +2735,25 @@
           <w:color w:val="1A5490"/>
           <w:sz w:val="18"/>
         </w:rPr>
-        <w:t>Le projet a été organisé en 4 notebooks Jupyter successifs</w:t>
+        <w:t xml:space="preserve">Le projet a été organisé en 4 notebooks </w:t>
+      </w:r>
+      <w:proofErr w:type="spellStart"/>
+      <w:r>
+        <w:rPr>
+          <w:rFonts w:ascii="Century Gothic" w:eastAsia="Century Gothic" w:hAnsi="Century Gothic" w:cs="Century Gothic"/>
+          <w:color w:val="1A5490"/>
+          <w:sz w:val="18"/>
+        </w:rPr>
+        <w:t>Jupyter</w:t>
+      </w:r>
+      <w:proofErr w:type="spellEnd"/>
+      <w:r>
+        <w:rPr>
+          <w:rFonts w:ascii="Century Gothic" w:eastAsia="Century Gothic" w:hAnsi="Century Gothic" w:cs="Century Gothic"/>
+          <w:color w:val="1A5490"/>
+          <w:sz w:val="18"/>
+        </w:rPr>
+        <w:t xml:space="preserve"> successifs</w:t>
       </w:r>
       <w:r>
         <w:rPr>
@@ -1863,6 +2824,7 @@
         </w:rPr>
         <w:t xml:space="preserve"> sélection de cohorte → </w:t>
       </w:r>
+      <w:proofErr w:type="spellStart"/>
       <w:r>
         <w:rPr>
           <w:rFonts w:ascii="Century Gothic" w:eastAsia="Century Gothic" w:hAnsi="Century Gothic" w:cs="Century Gothic"/>
@@ -1871,7 +2833,18 @@
           <w:color w:val="1A5490"/>
           <w:sz w:val="18"/>
         </w:rPr>
-        <w:t>filtered dataset</w:t>
+        <w:t>filtered</w:t>
+      </w:r>
+      <w:proofErr w:type="spellEnd"/>
+      <w:r>
+        <w:rPr>
+          <w:rFonts w:ascii="Century Gothic" w:eastAsia="Century Gothic" w:hAnsi="Century Gothic" w:cs="Century Gothic"/>
+          <w:i/>
+          <w:iCs/>
+          <w:color w:val="1A5490"/>
+          <w:sz w:val="18"/>
+        </w:rPr>
+        <w:t xml:space="preserve"> dataset</w:t>
       </w:r>
       <w:r>
         <w:rPr>
@@ -2194,6 +3167,7 @@
         </w:rPr>
         <w:t xml:space="preserve">: Annotation </w:t>
       </w:r>
+      <w:proofErr w:type="spellStart"/>
       <w:r>
         <w:rPr>
           <w:rFonts w:ascii="Century Gothic" w:eastAsia="Century Gothic" w:hAnsi="Century Gothic" w:cs="Century Gothic"/>
@@ -2201,7 +3175,17 @@
           <w:sz w:val="18"/>
           <w:lang w:val="en-US"/>
         </w:rPr>
-        <w:t xml:space="preserve">manuelle </w:t>
+        <w:t>manuelle</w:t>
+      </w:r>
+      <w:proofErr w:type="spellEnd"/>
+      <w:r>
+        <w:rPr>
+          <w:rFonts w:ascii="Century Gothic" w:eastAsia="Century Gothic" w:hAnsi="Century Gothic" w:cs="Century Gothic"/>
+          <w:color w:val="1A5490"/>
+          <w:sz w:val="18"/>
+          <w:lang w:val="en-US"/>
+        </w:rPr>
+        <w:t xml:space="preserve"> </w:t>
       </w:r>
       <w:r>
         <w:rPr>
@@ -2415,7 +3399,6 @@
         <w:ind w:left="305" w:hanging="320"/>
       </w:pPr>
       <w:r>
-        <w:lastRenderedPageBreak/>
         <w:t xml:space="preserve">Matériel et Méthodes </w:t>
       </w:r>
     </w:p>
@@ -2474,6 +3457,7 @@
         <w:rPr>
           <w:noProof/>
         </w:rPr>
+        <w:lastRenderedPageBreak/>
         <w:drawing>
           <wp:inline distT="0" distB="0" distL="0" distR="0" wp14:anchorId="39E9E57F" wp14:editId="11640A7A">
             <wp:extent cx="5998210" cy="1849120"/>
@@ -2542,8 +3526,29 @@
         <w:ind w:left="567" w:right="0" w:hanging="11"/>
         <w:jc w:val="left"/>
       </w:pPr>
-      <w:r>
-        <w:t xml:space="preserve">n_genes_by_counts : Nombre de gènes détectés par noyau (au moins 1 comptage UMI) • n_counts (total_counts) : Nombre total de transcrits UMI capturés par noyau (profondeur de séquençage) </w:t>
+      <w:proofErr w:type="spellStart"/>
+      <w:r>
+        <w:t>n_genes_by_counts</w:t>
+      </w:r>
+      <w:proofErr w:type="spellEnd"/>
+      <w:r>
+        <w:t xml:space="preserve"> : Nombre de gènes détectés par noyau (au moins 1 comptage UMI) • </w:t>
+      </w:r>
+      <w:proofErr w:type="spellStart"/>
+      <w:r>
+        <w:t>n_counts</w:t>
+      </w:r>
+      <w:proofErr w:type="spellEnd"/>
+      <w:r>
+        <w:t xml:space="preserve"> (</w:t>
+      </w:r>
+      <w:proofErr w:type="spellStart"/>
+      <w:r>
+        <w:t>total_counts</w:t>
+      </w:r>
+      <w:proofErr w:type="spellEnd"/>
+      <w:r>
+        <w:t xml:space="preserve">) : Nombre total de transcrits UMI capturés par noyau (profondeur de séquençage) </w:t>
       </w:r>
     </w:p>
     <w:p>
@@ -2557,8 +3562,13 @@
         <w:ind w:left="567" w:right="0" w:hanging="11"/>
         <w:jc w:val="left"/>
       </w:pPr>
-      <w:r>
-        <w:t xml:space="preserve">pct_counts_mt : Pourcentage de comptages mitochondriaux (indicateur de stress cellulaire ou mort) </w:t>
+      <w:proofErr w:type="spellStart"/>
+      <w:r>
+        <w:t>pct_counts_mt</w:t>
+      </w:r>
+      <w:proofErr w:type="spellEnd"/>
+      <w:r>
+        <w:t xml:space="preserve"> : Pourcentage de comptages mitochondriaux (indicateur de stress cellulaire ou mort) </w:t>
       </w:r>
     </w:p>
     <w:p>
@@ -2584,7 +3594,21 @@
         <w:rPr>
           <w:lang w:val="en-US"/>
         </w:rPr>
-        <w:t xml:space="preserve">1 000 ≤ n_genes_by_counts ≤ 6 000 </w:t>
+        <w:t xml:space="preserve">1 000 ≤ </w:t>
+      </w:r>
+      <w:proofErr w:type="spellStart"/>
+      <w:r>
+        <w:rPr>
+          <w:lang w:val="en-US"/>
+        </w:rPr>
+        <w:t>n_genes_by_counts</w:t>
+      </w:r>
+      <w:proofErr w:type="spellEnd"/>
+      <w:r>
+        <w:rPr>
+          <w:lang w:val="en-US"/>
+        </w:rPr>
+        <w:t xml:space="preserve"> ≤ 6 000 </w:t>
       </w:r>
     </w:p>
     <w:p>
@@ -2596,11 +3620,19 @@
           <w:lang w:val="en-US"/>
         </w:rPr>
       </w:pPr>
+      <w:proofErr w:type="spellStart"/>
       <w:r>
         <w:rPr>
           <w:lang w:val="en-US"/>
         </w:rPr>
-        <w:t xml:space="preserve">pct_counts_mt ≤ 5% </w:t>
+        <w:t>pct_counts_mt</w:t>
+      </w:r>
+      <w:proofErr w:type="spellEnd"/>
+      <w:r>
+        <w:rPr>
+          <w:lang w:val="en-US"/>
+        </w:rPr>
+        <w:t xml:space="preserve"> ≤ 5% </w:t>
       </w:r>
     </w:p>
     <w:p>
@@ -2610,7 +3642,15 @@
         <w:jc w:val="left"/>
       </w:pPr>
       <w:r>
-        <w:t xml:space="preserve">Résultat du filtrage QC : 285 076 noyaux (pré-filtrés) → 243 011 noyaux (post-QC) → Rétention de 85,3% </w:t>
+        <w:t>Résultat du filtrage QC : 285 076 noyaux (</w:t>
+      </w:r>
+      <w:proofErr w:type="spellStart"/>
+      <w:r>
+        <w:t>pré-filtrés</w:t>
+      </w:r>
+      <w:proofErr w:type="spellEnd"/>
+      <w:r>
+        <w:t xml:space="preserve">) → 243 011 noyaux (post-QC) → Rétention de 85,3% </w:t>
       </w:r>
     </w:p>
     <w:p>
@@ -2670,22 +3710,41 @@
         <w:spacing w:after="0" w:line="240" w:lineRule="auto"/>
         <w:ind w:left="567" w:right="35" w:firstLine="0"/>
       </w:pPr>
+      <w:proofErr w:type="spellStart"/>
       <w:r>
         <w:rPr>
           <w:rFonts w:ascii="Century Gothic" w:eastAsia="Century Gothic" w:hAnsi="Century Gothic" w:cs="Century Gothic"/>
           <w:color w:val="1A5490"/>
           <w:sz w:val="18"/>
         </w:rPr>
-        <w:t xml:space="preserve">pct_counts_mt &gt; 5% : Dans le bulk RNA-seq classique, des valeurs élevées (&gt;10-20%) indiquent des cellules stressées ou apoptotiques (fuite de l'ARN nucléaire, enrichissement relatif des transcrits </w:t>
-      </w:r>
+        <w:t>pct_counts_mt</w:t>
+      </w:r>
+      <w:proofErr w:type="spellEnd"/>
       <w:r>
         <w:rPr>
           <w:rFonts w:ascii="Century Gothic" w:eastAsia="Century Gothic" w:hAnsi="Century Gothic" w:cs="Century Gothic"/>
           <w:color w:val="1A5490"/>
           <w:sz w:val="18"/>
         </w:rPr>
-        <w:lastRenderedPageBreak/>
-        <w:t>mitochondriaux). ATTENTION : En snRNA-seq (séquençage de noyaux), pct_counts_mt est naturellement très faible (~0%) car les mitochondries (organites cytoplasmiques) ne sont PAS capturées avec les noyaux. Un seuil strict à 5% élimine les rares contaminations cytoplasmiques.</w:t>
+        <w:t xml:space="preserve"> &gt; 5% : Dans le bulk RNA-seq classique, des valeurs élevées (&gt;10-20%) indiquent des cellules stressées ou apoptotiques (fuite de l'ARN nucléaire, enrichissement relatif des transcrits mitochondriaux). ATTENTION : En snRNA-seq (séquençage de noyaux), </w:t>
+      </w:r>
+      <w:proofErr w:type="spellStart"/>
+      <w:r>
+        <w:rPr>
+          <w:rFonts w:ascii="Century Gothic" w:eastAsia="Century Gothic" w:hAnsi="Century Gothic" w:cs="Century Gothic"/>
+          <w:color w:val="1A5490"/>
+          <w:sz w:val="18"/>
+        </w:rPr>
+        <w:t>pct_counts_mt</w:t>
+      </w:r>
+      <w:proofErr w:type="spellEnd"/>
+      <w:r>
+        <w:rPr>
+          <w:rFonts w:ascii="Century Gothic" w:eastAsia="Century Gothic" w:hAnsi="Century Gothic" w:cs="Century Gothic"/>
+          <w:color w:val="1A5490"/>
+          <w:sz w:val="18"/>
+        </w:rPr>
+        <w:t xml:space="preserve"> est naturellement très faible (~0%) car les mitochondries (organites cytoplasmiques) ne sont PAS capturées avec les noyaux. Un seuil strict à 5% élimine les rares contaminations cytoplasmiques.</w:t>
       </w:r>
       <w:r>
         <w:t xml:space="preserve"> </w:t>
@@ -2775,7 +3834,15 @@
         <w:t xml:space="preserve">La cohorte a été réduite du dataset initial de 6,3 millions de noyaux </w:t>
       </w:r>
       <w:r>
-        <w:t>(693 682 après pré-filtrage technique réalisé par Lee et al. (2024) et standardisation du portail CellxGene)</w:t>
+        <w:t xml:space="preserve">(693 682 après pré-filtrage technique réalisé par Lee et al. (2024) et standardisation du portail </w:t>
+      </w:r>
+      <w:proofErr w:type="spellStart"/>
+      <w:r>
+        <w:t>CellxGene</w:t>
+      </w:r>
+      <w:proofErr w:type="spellEnd"/>
+      <w:r>
+        <w:t>)</w:t>
       </w:r>
       <w:r>
         <w:t xml:space="preserve"> à un ensemble analytique de 62 800 noyaux via une stratégie de filtrage en plusieurs étapes. </w:t>
@@ -2788,6 +3855,7 @@
         <w:ind w:left="593" w:hanging="608"/>
       </w:pPr>
       <w:r>
+        <w:lastRenderedPageBreak/>
         <w:t xml:space="preserve">Critères d'inclusion et d'exclusion </w:t>
       </w:r>
     </w:p>
@@ -2864,7 +3932,15 @@
         <w:jc w:val="left"/>
       </w:pPr>
       <w:r>
-        <w:t>Les critères d'exclusion ont éliminé systématiquement toutes les comorbidités (démence vasculaire, diabète, tauopathies autres) ainsi que les formes mixtes (ex: co-occurence AD+PD).</w:t>
+        <w:t xml:space="preserve">Les critères d'exclusion ont éliminé systématiquement toutes les comorbidités (démence vasculaire, diabète, tauopathies autres) ainsi que les formes mixtes (ex: </w:t>
+      </w:r>
+      <w:proofErr w:type="spellStart"/>
+      <w:r>
+        <w:t>co-occurence</w:t>
+      </w:r>
+      <w:proofErr w:type="spellEnd"/>
+      <w:r>
+        <w:t xml:space="preserve"> AD+PD).</w:t>
       </w:r>
     </w:p>
     <w:p>
@@ -2923,7 +3999,15 @@
         <w:jc w:val="left"/>
       </w:pPr>
       <w:r>
-        <w:t xml:space="preserve">Exclusion de l'ascendance 'unknown' (18,8%, n=130 601 noyaux) </w:t>
+        <w:t>Exclusion de l'ascendance '</w:t>
+      </w:r>
+      <w:proofErr w:type="spellStart"/>
+      <w:r>
+        <w:t>unknown</w:t>
+      </w:r>
+      <w:proofErr w:type="spellEnd"/>
+      <w:r>
+        <w:t xml:space="preserve">' (18,8%, n=130 601 noyaux) </w:t>
       </w:r>
     </w:p>
     <w:p>
@@ -3256,7 +4340,6 @@
         <w:ind w:left="-5" w:right="35"/>
       </w:pPr>
       <w:r>
-        <w:lastRenderedPageBreak/>
         <w:t xml:space="preserve">La cohorte finale comprend 17 donneurs post-mortem et 62 800 noyaux. Le Tableau 1 résume les caractéristiques démographiques et cellulaires par groupe diagnostique. </w:t>
       </w:r>
     </w:p>
@@ -3411,7 +4494,23 @@
                 <w:b/>
                 <w:sz w:val="22"/>
               </w:rPr>
-              <w:t>(moy.)</w:t>
+              <w:t>(</w:t>
+            </w:r>
+            <w:proofErr w:type="spellStart"/>
+            <w:r>
+              <w:rPr>
+                <w:b/>
+                <w:sz w:val="22"/>
+              </w:rPr>
+              <w:t>moy</w:t>
+            </w:r>
+            <w:proofErr w:type="spellEnd"/>
+            <w:r>
+              <w:rPr>
+                <w:b/>
+                <w:sz w:val="22"/>
+              </w:rPr>
+              <w:t>.)</w:t>
             </w:r>
             <w:r>
               <w:rPr>
@@ -4159,6 +5258,7 @@
           <w:color w:val="1A5490"/>
           <w:sz w:val="18"/>
         </w:rPr>
+        <w:lastRenderedPageBreak/>
         <w:t>Faible taille du groupe PD (n=3 donneurs)</w:t>
       </w:r>
       <w:r>
@@ -4235,7 +5335,25 @@
           <w:color w:val="1A5490"/>
           <w:sz w:val="18"/>
         </w:rPr>
-        <w:t xml:space="preserve">Conséquence méthodologique : Afin de neutraliser ce biais potentiel, le sexe biologique a été inclus comme co-variable dans le modèle linéaire </w:t>
+        <w:t xml:space="preserve">Conséquence méthodologique : Afin de neutraliser ce biais potentiel, le sexe biologique a été inclus comme </w:t>
+      </w:r>
+      <w:proofErr w:type="spellStart"/>
+      <w:r>
+        <w:rPr>
+          <w:rFonts w:ascii="Century Gothic" w:eastAsia="Century Gothic" w:hAnsi="Century Gothic" w:cs="Century Gothic"/>
+          <w:color w:val="1A5490"/>
+          <w:sz w:val="18"/>
+        </w:rPr>
+        <w:t>co</w:t>
+      </w:r>
+      <w:proofErr w:type="spellEnd"/>
+      <w:r>
+        <w:rPr>
+          <w:rFonts w:ascii="Century Gothic" w:eastAsia="Century Gothic" w:hAnsi="Century Gothic" w:cs="Century Gothic"/>
+          <w:color w:val="1A5490"/>
+          <w:sz w:val="18"/>
+        </w:rPr>
+        <w:t xml:space="preserve">-variable dans le modèle linéaire </w:t>
       </w:r>
       <w:r>
         <w:rPr>
@@ -4387,7 +5505,23 @@
         <w:ind w:right="35"/>
       </w:pPr>
       <w:r>
-        <w:t xml:space="preserve">Sauvegarde des comptages bruts : Les comptages UMI bruts ont été préservés dans adata.layers['counts'] AVANT toute transformation. Cette étape est critique pour l'analyse différentielle ultérieure (DESeq2 exige des comptages entiers non normalisés). </w:t>
+        <w:t xml:space="preserve">Sauvegarde des comptages bruts : Les comptages UMI bruts ont été préservés dans </w:t>
+      </w:r>
+      <w:proofErr w:type="spellStart"/>
+      <w:r>
+        <w:t>adata.layers</w:t>
+      </w:r>
+      <w:proofErr w:type="spellEnd"/>
+      <w:r>
+        <w:t>['</w:t>
+      </w:r>
+      <w:proofErr w:type="spellStart"/>
+      <w:r>
+        <w:t>counts</w:t>
+      </w:r>
+      <w:proofErr w:type="spellEnd"/>
+      <w:r>
+        <w:t xml:space="preserve">'] AVANT toute transformation. Cette étape est critique pour l'analyse différentielle ultérieure (DESeq2 exige des comptages entiers non normalisés). </w:t>
       </w:r>
     </w:p>
     <w:p>
@@ -4410,7 +5544,23 @@
         <w:ind w:right="35"/>
       </w:pPr>
       <w:r>
-        <w:t xml:space="preserve">Normalisation par profondeur de séquençage : Chaque noyau a été normalisé à 10 000 UMI totaux (scanpy.pp.normalize_total, target_sum=1e4) pour corriger les différences de profondeur de séquençage entre noyaux. </w:t>
+        <w:t>Normalisation par profondeur de séquençage : Chaque noyau a été normalisé à 10 000 UMI totaux (</w:t>
+      </w:r>
+      <w:proofErr w:type="spellStart"/>
+      <w:r>
+        <w:t>scanpy.pp.normalize_total</w:t>
+      </w:r>
+      <w:proofErr w:type="spellEnd"/>
+      <w:r>
+        <w:t xml:space="preserve">, </w:t>
+      </w:r>
+      <w:proofErr w:type="spellStart"/>
+      <w:r>
+        <w:t>target_sum</w:t>
+      </w:r>
+      <w:proofErr w:type="spellEnd"/>
+      <w:r>
+        <w:t xml:space="preserve">=1e4) pour corriger les différences de profondeur de séquençage entre noyaux. </w:t>
       </w:r>
     </w:p>
     <w:p>
@@ -4456,7 +5606,23 @@
         <w:ind w:right="35"/>
       </w:pPr>
       <w:r>
-        <w:t xml:space="preserve">Sélection des gènes hautement variables (HVGs) : Identification et conservation des 2 000 gènes présentant la plus forte variabilité biologique entre noyaux (méthode Seurat v3, scanpy.pp.highly_variable_genes). Cette étape réduit le bruit technique et la charge computationnelle tout en préservant le signal biologique. </w:t>
+        <w:t>Sélection des gènes hautement variables (</w:t>
+      </w:r>
+      <w:proofErr w:type="spellStart"/>
+      <w:r>
+        <w:t>HVGs</w:t>
+      </w:r>
+      <w:proofErr w:type="spellEnd"/>
+      <w:r>
+        <w:t xml:space="preserve">) : Identification et conservation des 2 000 gènes présentant la plus forte variabilité biologique entre noyaux (méthode Seurat v3, </w:t>
+      </w:r>
+      <w:proofErr w:type="spellStart"/>
+      <w:r>
+        <w:t>scanpy.pp.highly_variable_genes</w:t>
+      </w:r>
+      <w:proofErr w:type="spellEnd"/>
+      <w:r>
+        <w:t xml:space="preserve">). Cette étape réduit le bruit technique et la charge computationnelle tout en préservant le signal biologique. </w:t>
       </w:r>
     </w:p>
     <w:p>
@@ -4480,7 +5646,47 @@
           <w:color w:val="666666"/>
           <w:sz w:val="18"/>
         </w:rPr>
-        <w:t xml:space="preserve"> NOTE TECHNIQUE - Importance critique de la préservation des raw counts </w:t>
+        <w:t xml:space="preserve"> NOTE TECHNIQUE - Importance critique de la préservation des </w:t>
+      </w:r>
+      <w:proofErr w:type="spellStart"/>
+      <w:r>
+        <w:rPr>
+          <w:rFonts w:ascii="Century Gothic" w:eastAsia="Century Gothic" w:hAnsi="Century Gothic" w:cs="Century Gothic"/>
+          <w:b/>
+          <w:color w:val="666666"/>
+          <w:sz w:val="18"/>
+        </w:rPr>
+        <w:t>raw</w:t>
+      </w:r>
+      <w:proofErr w:type="spellEnd"/>
+      <w:r>
+        <w:rPr>
+          <w:rFonts w:ascii="Century Gothic" w:eastAsia="Century Gothic" w:hAnsi="Century Gothic" w:cs="Century Gothic"/>
+          <w:b/>
+          <w:color w:val="666666"/>
+          <w:sz w:val="18"/>
+        </w:rPr>
+        <w:t xml:space="preserve"> </w:t>
+      </w:r>
+      <w:proofErr w:type="spellStart"/>
+      <w:r>
+        <w:rPr>
+          <w:rFonts w:ascii="Century Gothic" w:eastAsia="Century Gothic" w:hAnsi="Century Gothic" w:cs="Century Gothic"/>
+          <w:b/>
+          <w:color w:val="666666"/>
+          <w:sz w:val="18"/>
+        </w:rPr>
+        <w:t>counts</w:t>
+      </w:r>
+      <w:proofErr w:type="spellEnd"/>
+      <w:r>
+        <w:rPr>
+          <w:rFonts w:ascii="Century Gothic" w:eastAsia="Century Gothic" w:hAnsi="Century Gothic" w:cs="Century Gothic"/>
+          <w:b/>
+          <w:color w:val="666666"/>
+          <w:sz w:val="18"/>
+        </w:rPr>
+        <w:t xml:space="preserve"> </w:t>
       </w:r>
       <w:r>
         <w:rPr>
@@ -4503,7 +5709,6 @@
           <w:color w:val="666666"/>
           <w:sz w:val="18"/>
         </w:rPr>
-        <w:lastRenderedPageBreak/>
         <w:t xml:space="preserve"> </w:t>
       </w:r>
     </w:p>
@@ -4519,7 +5724,25 @@
           <w:color w:val="666666"/>
           <w:sz w:val="18"/>
         </w:rPr>
-        <w:t xml:space="preserve">Le modèle statistique de DESeq2 modélise la distribution des comptages comme suit : Comptages ~ NegativeBinomial(μ, dispersion) où μ dépend de la taille de la bibliothèque (size factor) et de l'expression du gène. </w:t>
+        <w:t xml:space="preserve">Le modèle statistique de DESeq2 modélise la distribution des comptages comme suit : Comptages ~ </w:t>
+      </w:r>
+      <w:proofErr w:type="spellStart"/>
+      <w:r>
+        <w:rPr>
+          <w:rFonts w:ascii="Century Gothic" w:eastAsia="Century Gothic" w:hAnsi="Century Gothic" w:cs="Century Gothic"/>
+          <w:color w:val="666666"/>
+          <w:sz w:val="18"/>
+        </w:rPr>
+        <w:t>NegativeBinomial</w:t>
+      </w:r>
+      <w:proofErr w:type="spellEnd"/>
+      <w:r>
+        <w:rPr>
+          <w:rFonts w:ascii="Century Gothic" w:eastAsia="Century Gothic" w:hAnsi="Century Gothic" w:cs="Century Gothic"/>
+          <w:color w:val="666666"/>
+          <w:sz w:val="18"/>
+        </w:rPr>
+        <w:t xml:space="preserve">(μ, dispersion) où μ dépend de la taille de la bibliothèque (size factor) et de l'expression du gène. </w:t>
       </w:r>
     </w:p>
     <w:p>
@@ -4549,7 +5772,25 @@
           <w:color w:val="666666"/>
           <w:sz w:val="18"/>
         </w:rPr>
-        <w:t xml:space="preserve">Si on fournit des données déjà normalisées ou log-transformées, ce modèle est mathématiquement invalide (les valeurs ne sont plus des entiers, la variance n'est plus proportionnelle à la moyenne). Conséquence : Les p-values et les estimations de foldchange deviennent incorrectes. </w:t>
+        <w:t xml:space="preserve">Si on fournit des données déjà normalisées ou log-transformées, ce modèle est mathématiquement invalide (les valeurs ne sont plus des entiers, la variance n'est plus proportionnelle à la moyenne). Conséquence : Les p-values et les estimations de </w:t>
+      </w:r>
+      <w:proofErr w:type="spellStart"/>
+      <w:r>
+        <w:rPr>
+          <w:rFonts w:ascii="Century Gothic" w:eastAsia="Century Gothic" w:hAnsi="Century Gothic" w:cs="Century Gothic"/>
+          <w:color w:val="666666"/>
+          <w:sz w:val="18"/>
+        </w:rPr>
+        <w:t>foldchange</w:t>
+      </w:r>
+      <w:proofErr w:type="spellEnd"/>
+      <w:r>
+        <w:rPr>
+          <w:rFonts w:ascii="Century Gothic" w:eastAsia="Century Gothic" w:hAnsi="Century Gothic" w:cs="Century Gothic"/>
+          <w:color w:val="666666"/>
+          <w:sz w:val="18"/>
+        </w:rPr>
+        <w:t xml:space="preserve"> deviennent incorrectes. </w:t>
       </w:r>
     </w:p>
     <w:p>
@@ -4579,7 +5820,43 @@
           <w:color w:val="666666"/>
           <w:sz w:val="18"/>
         </w:rPr>
-        <w:t>C'est pourquoi adata.layers['counts'] doit impérativement contenir les comptages bruts originaux.</w:t>
+        <w:t xml:space="preserve">C'est pourquoi </w:t>
+      </w:r>
+      <w:proofErr w:type="spellStart"/>
+      <w:r>
+        <w:rPr>
+          <w:rFonts w:ascii="Century Gothic" w:eastAsia="Century Gothic" w:hAnsi="Century Gothic" w:cs="Century Gothic"/>
+          <w:color w:val="666666"/>
+          <w:sz w:val="18"/>
+        </w:rPr>
+        <w:t>adata.layers</w:t>
+      </w:r>
+      <w:proofErr w:type="spellEnd"/>
+      <w:r>
+        <w:rPr>
+          <w:rFonts w:ascii="Century Gothic" w:eastAsia="Century Gothic" w:hAnsi="Century Gothic" w:cs="Century Gothic"/>
+          <w:color w:val="666666"/>
+          <w:sz w:val="18"/>
+        </w:rPr>
+        <w:t>['</w:t>
+      </w:r>
+      <w:proofErr w:type="spellStart"/>
+      <w:r>
+        <w:rPr>
+          <w:rFonts w:ascii="Century Gothic" w:eastAsia="Century Gothic" w:hAnsi="Century Gothic" w:cs="Century Gothic"/>
+          <w:color w:val="666666"/>
+          <w:sz w:val="18"/>
+        </w:rPr>
+        <w:t>counts</w:t>
+      </w:r>
+      <w:proofErr w:type="spellEnd"/>
+      <w:r>
+        <w:rPr>
+          <w:rFonts w:ascii="Century Gothic" w:eastAsia="Century Gothic" w:hAnsi="Century Gothic" w:cs="Century Gothic"/>
+          <w:color w:val="666666"/>
+          <w:sz w:val="18"/>
+        </w:rPr>
+        <w:t>'] doit impérativement contenir les comptages bruts originaux.</w:t>
       </w:r>
       <w:r>
         <w:t xml:space="preserve"> </w:t>
@@ -4618,7 +5895,31 @@
         <w:ind w:left="-5" w:right="35"/>
       </w:pPr>
       <w:r>
-        <w:t xml:space="preserve">Une Analyse en Composantes Principales (PCA) a été calculée sur les 2 000 HVGs (50 composantes principales, scanpy.tl.pca). Les 30 premières PCs, capturant la majorité de la variance biologique (Figure 4), ont été retenues pour les étapes suivantes. </w:t>
+        <w:t xml:space="preserve">Une Analyse en Composantes Principales (PCA) a été calculée sur les 2 000 </w:t>
+      </w:r>
+      <w:proofErr w:type="spellStart"/>
+      <w:r>
+        <w:t>HVGs</w:t>
+      </w:r>
+      <w:proofErr w:type="spellEnd"/>
+      <w:r>
+        <w:t xml:space="preserve"> (50 composantes principales, </w:t>
+      </w:r>
+      <w:proofErr w:type="spellStart"/>
+      <w:r>
+        <w:t>scanpy.tl.pca</w:t>
+      </w:r>
+      <w:proofErr w:type="spellEnd"/>
+      <w:r>
+        <w:t xml:space="preserve">). Les 30 premières </w:t>
+      </w:r>
+      <w:proofErr w:type="spellStart"/>
+      <w:r>
+        <w:t>PCs</w:t>
+      </w:r>
+      <w:proofErr w:type="spellEnd"/>
+      <w:r>
+        <w:t xml:space="preserve">, capturant la majorité de la variance biologique (Figure 4), ont été retenues pour les étapes suivantes. </w:t>
       </w:r>
     </w:p>
     <w:p>
@@ -4645,6 +5946,7 @@
         <w:jc w:val="left"/>
       </w:pPr>
       <w:r>
+        <w:lastRenderedPageBreak/>
         <w:t xml:space="preserve">Construction du graphe de voisinage : </w:t>
       </w:r>
     </w:p>
@@ -4654,7 +5956,47 @@
         <w:ind w:left="-5" w:right="35"/>
       </w:pPr>
       <w:r>
-        <w:t xml:space="preserve">Un graphe k-nearest neighbors (kNN) a été construit dans l'espace PCA à 30 dimensions (scanpy.pp.neighbors, n_neighbors=15). Ce graphe représente la similarité transcriptomique entre noyaux : deux noyaux sont connectés s'ils figurent parmi les 15 voisins les plus proches l'un de l'autre. </w:t>
+        <w:t>Un graphe k-</w:t>
+      </w:r>
+      <w:proofErr w:type="spellStart"/>
+      <w:r>
+        <w:t>nearest</w:t>
+      </w:r>
+      <w:proofErr w:type="spellEnd"/>
+      <w:r>
+        <w:t xml:space="preserve"> </w:t>
+      </w:r>
+      <w:proofErr w:type="spellStart"/>
+      <w:r>
+        <w:t>neighbors</w:t>
+      </w:r>
+      <w:proofErr w:type="spellEnd"/>
+      <w:r>
+        <w:t xml:space="preserve"> (</w:t>
+      </w:r>
+      <w:proofErr w:type="spellStart"/>
+      <w:r>
+        <w:t>kNN</w:t>
+      </w:r>
+      <w:proofErr w:type="spellEnd"/>
+      <w:r>
+        <w:t>) a été construit dans l'espace PCA à 30 dimensions (</w:t>
+      </w:r>
+      <w:proofErr w:type="spellStart"/>
+      <w:r>
+        <w:t>scanpy.pp.neighbors</w:t>
+      </w:r>
+      <w:proofErr w:type="spellEnd"/>
+      <w:r>
+        <w:t xml:space="preserve">, </w:t>
+      </w:r>
+      <w:proofErr w:type="spellStart"/>
+      <w:r>
+        <w:t>n_neighbors</w:t>
+      </w:r>
+      <w:proofErr w:type="spellEnd"/>
+      <w:r>
+        <w:t xml:space="preserve">=15). Ce graphe représente la similarité transcriptomique entre noyaux : deux noyaux sont connectés s'ils figurent parmi les 15 voisins les plus proches l'un de l'autre. </w:t>
       </w:r>
     </w:p>
     <w:p>
@@ -4687,7 +6029,23 @@
         <w:ind w:left="-5" w:right="35"/>
       </w:pPr>
       <w:r>
-        <w:t xml:space="preserve">L'algorithme de détection de communautés Leiden (résolution=0.5, scanpy.tl.leiden) a été appliqué au graphe de voisinage pour partitionner les 62 800 noyaux en 23 clusters initiaux. Chaque cluster représente un groupe de noyaux transcriptomiquement homogènes, potentiellement correspondant à un type/sous-type cellulaire ou à un état fonctionnel distinct. </w:t>
+        <w:t xml:space="preserve">L'algorithme de détection de communautés Leiden (résolution=0.5, </w:t>
+      </w:r>
+      <w:proofErr w:type="spellStart"/>
+      <w:r>
+        <w:t>scanpy.tl.leiden</w:t>
+      </w:r>
+      <w:proofErr w:type="spellEnd"/>
+      <w:r>
+        <w:t xml:space="preserve">) a été appliqué au graphe de voisinage pour partitionner les 62 800 noyaux en 23 clusters initiaux. Chaque cluster représente un groupe de noyaux </w:t>
+      </w:r>
+      <w:proofErr w:type="spellStart"/>
+      <w:r>
+        <w:t>transcriptomiquement</w:t>
+      </w:r>
+      <w:proofErr w:type="spellEnd"/>
+      <w:r>
+        <w:t xml:space="preserve"> homogènes, potentiellement correspondant à un type/sous-type cellulaire ou à un état fonctionnel distinct. </w:t>
       </w:r>
     </w:p>
     <w:p>
@@ -4720,7 +6078,15 @@
         <w:ind w:left="-5" w:right="35"/>
       </w:pPr>
       <w:r>
-        <w:t xml:space="preserve">Une projection UMAP (Uniform Manifold Approximation and Projection, scanpy.tl.umap) a été générée pour visualiser la structure globale du dataset en 2 dimensions (Figure 5). </w:t>
+        <w:t xml:space="preserve">Une projection UMAP (Uniform Manifold Approximation and Projection, </w:t>
+      </w:r>
+      <w:proofErr w:type="spellStart"/>
+      <w:r>
+        <w:t>scanpy.tl.umap</w:t>
+      </w:r>
+      <w:proofErr w:type="spellEnd"/>
+      <w:r>
+        <w:t xml:space="preserve">) a été générée pour visualiser la structure globale du dataset en 2 dimensions (Figure 5). </w:t>
       </w:r>
     </w:p>
     <w:p>
@@ -4749,7 +6115,31 @@
         <w:ind w:left="-5" w:right="35"/>
       </w:pPr>
       <w:r>
-        <w:t xml:space="preserve">Les 23 clusters Leiden ont été annotés manuellement en 8 macro-types cellulaires basés sur l'expression de marqueurs canoniques de la littérature (Tableau 2). Cette annotation a été réalisée via l'inspection des gènes différentiellement exprimés par cluster (test de Wilcoxon, scanpy.tl.rank_genes_groups) et comparée aux atlas de référence (PanglaoDB, CellMarker). </w:t>
+        <w:t xml:space="preserve">Les 23 clusters Leiden ont été annotés manuellement en 8 macro-types cellulaires basés sur l'expression de marqueurs canoniques de la littérature (Tableau 2). Cette annotation a été réalisée via l'inspection des gènes différentiellement exprimés par cluster (test de Wilcoxon, </w:t>
+      </w:r>
+      <w:proofErr w:type="spellStart"/>
+      <w:r>
+        <w:t>scanpy.tl.rank_genes_groups</w:t>
+      </w:r>
+      <w:proofErr w:type="spellEnd"/>
+      <w:r>
+        <w:t>) et comparée aux atlas de référence (</w:t>
+      </w:r>
+      <w:proofErr w:type="spellStart"/>
+      <w:r>
+        <w:t>PanglaoDB</w:t>
+      </w:r>
+      <w:proofErr w:type="spellEnd"/>
+      <w:r>
+        <w:t xml:space="preserve">, </w:t>
+      </w:r>
+      <w:proofErr w:type="spellStart"/>
+      <w:r>
+        <w:t>CellMarker</w:t>
+      </w:r>
+      <w:proofErr w:type="spellEnd"/>
+      <w:r>
+        <w:t xml:space="preserve">). </w:t>
       </w:r>
     </w:p>
     <w:tbl>
@@ -5458,7 +6848,6 @@
                 <w:b/>
                 <w:sz w:val="22"/>
               </w:rPr>
-              <w:lastRenderedPageBreak/>
               <w:t>Astrocytes Réactifs</w:t>
             </w:r>
             <w:r>
@@ -5718,7 +7107,23 @@
                 <w:b/>
                 <w:sz w:val="22"/>
               </w:rPr>
-              <w:t>Support/Vascular/Immune</w:t>
+              <w:t>Support/</w:t>
+            </w:r>
+            <w:proofErr w:type="spellStart"/>
+            <w:r>
+              <w:rPr>
+                <w:b/>
+                <w:sz w:val="22"/>
+              </w:rPr>
+              <w:t>Vascular</w:t>
+            </w:r>
+            <w:proofErr w:type="spellEnd"/>
+            <w:r>
+              <w:rPr>
+                <w:b/>
+                <w:sz w:val="22"/>
+              </w:rPr>
+              <w:t>/Immune</w:t>
             </w:r>
             <w:r>
               <w:rPr>
@@ -5849,13 +7254,31 @@
               <w:ind w:left="0" w:right="0" w:firstLine="0"/>
               <w:jc w:val="left"/>
             </w:pPr>
+            <w:proofErr w:type="spellStart"/>
             <w:r>
               <w:rPr>
                 <w:b/>
                 <w:sz w:val="22"/>
               </w:rPr>
-              <w:t>Unknown/Low Quality</w:t>
-            </w:r>
+              <w:t>Unknown</w:t>
+            </w:r>
+            <w:proofErr w:type="spellEnd"/>
+            <w:r>
+              <w:rPr>
+                <w:b/>
+                <w:sz w:val="22"/>
+              </w:rPr>
+              <w:t xml:space="preserve">/Low </w:t>
+            </w:r>
+            <w:proofErr w:type="spellStart"/>
+            <w:r>
+              <w:rPr>
+                <w:b/>
+                <w:sz w:val="22"/>
+              </w:rPr>
+              <w:t>Quality</w:t>
+            </w:r>
+            <w:proofErr w:type="spellEnd"/>
             <w:r>
               <w:rPr>
                 <w:b/>
@@ -5975,7 +7398,39 @@
           <w:i/>
           <w:sz w:val="20"/>
         </w:rPr>
-        <w:t>Tableau 2. Annotation manuelle des 23 clusters Leiden en 8 macro-types cellulaires. Les clusters 21-22 (Unknown/Low Quality) ont été exclus de l'analyse pseudobulk finale.</w:t>
+        <w:t>Tableau 2. Annotation manuelle des 23 clusters Leiden en 8 macro-types cellulaires. Les clusters 21-22 (</w:t>
+      </w:r>
+      <w:proofErr w:type="spellStart"/>
+      <w:r>
+        <w:rPr>
+          <w:i/>
+          <w:sz w:val="20"/>
+        </w:rPr>
+        <w:t>Unknown</w:t>
+      </w:r>
+      <w:proofErr w:type="spellEnd"/>
+      <w:r>
+        <w:rPr>
+          <w:i/>
+          <w:sz w:val="20"/>
+        </w:rPr>
+        <w:t xml:space="preserve">/Low </w:t>
+      </w:r>
+      <w:proofErr w:type="spellStart"/>
+      <w:r>
+        <w:rPr>
+          <w:i/>
+          <w:sz w:val="20"/>
+        </w:rPr>
+        <w:t>Quality</w:t>
+      </w:r>
+      <w:proofErr w:type="spellEnd"/>
+      <w:r>
+        <w:rPr>
+          <w:i/>
+          <w:sz w:val="20"/>
+        </w:rPr>
+        <w:t>) ont été exclus de l'analyse pseudobulk finale.</w:t>
       </w:r>
       <w:r>
         <w:t xml:space="preserve"> </w:t>
@@ -6017,7 +7472,43 @@
           <w:color w:val="666666"/>
           <w:sz w:val="18"/>
         </w:rPr>
-        <w:t xml:space="preserve">Problème identifié : Le Cluster 18, initialement annoté comme 'Microglie DAM' (DiseaseAssociated Microglia, signature APOE+/TREM2+/P2RY12-), contenait 393 noyaux provenant à 98,2% d'un SEUL donneur (Donor_865). Les 16 autres donneurs contribuaient à peine 7 noyaux au total. </w:t>
+        <w:t>Problème identifié : Le Cluster 18, initialement annoté comme 'Microglie DAM' (</w:t>
+      </w:r>
+      <w:proofErr w:type="spellStart"/>
+      <w:r>
+        <w:rPr>
+          <w:rFonts w:ascii="Century Gothic" w:eastAsia="Century Gothic" w:hAnsi="Century Gothic" w:cs="Century Gothic"/>
+          <w:color w:val="666666"/>
+          <w:sz w:val="18"/>
+        </w:rPr>
+        <w:t>DiseaseAssociated</w:t>
+      </w:r>
+      <w:proofErr w:type="spellEnd"/>
+      <w:r>
+        <w:rPr>
+          <w:rFonts w:ascii="Century Gothic" w:eastAsia="Century Gothic" w:hAnsi="Century Gothic" w:cs="Century Gothic"/>
+          <w:color w:val="666666"/>
+          <w:sz w:val="18"/>
+        </w:rPr>
+        <w:t xml:space="preserve"> </w:t>
+      </w:r>
+      <w:proofErr w:type="spellStart"/>
+      <w:r>
+        <w:rPr>
+          <w:rFonts w:ascii="Century Gothic" w:eastAsia="Century Gothic" w:hAnsi="Century Gothic" w:cs="Century Gothic"/>
+          <w:color w:val="666666"/>
+          <w:sz w:val="18"/>
+        </w:rPr>
+        <w:t>Microglia</w:t>
+      </w:r>
+      <w:proofErr w:type="spellEnd"/>
+      <w:r>
+        <w:rPr>
+          <w:rFonts w:ascii="Century Gothic" w:eastAsia="Century Gothic" w:hAnsi="Century Gothic" w:cs="Century Gothic"/>
+          <w:color w:val="666666"/>
+          <w:sz w:val="18"/>
+        </w:rPr>
+        <w:t xml:space="preserve">, signature APOE+/TREM2+/P2RY12-), contenait 393 noyaux provenant à 98,2% d'un SEUL donneur (Donor_865). Les 16 autres donneurs contribuaient à peine 7 noyaux au total. </w:t>
       </w:r>
     </w:p>
     <w:p>
@@ -6032,6 +7523,7 @@
           <w:color w:val="666666"/>
           <w:sz w:val="18"/>
         </w:rPr>
+        <w:lastRenderedPageBreak/>
         <w:t xml:space="preserve"> </w:t>
       </w:r>
     </w:p>
@@ -6047,7 +7539,25 @@
           <w:color w:val="666666"/>
           <w:sz w:val="18"/>
         </w:rPr>
-        <w:t xml:space="preserve">Décision méthodologique : Fusion avec le Cluster 5 (Microglie Homéostatique) pour former un macro-type 'Microglie' unifié (n=4 875 noyaux, 15 donneurs avec ≥20 cellules). Justification : L'approche pseudobulk exige un minimum de 5 donneurs par type cellulaire pour garantir des réplicats biologiques suffisants et éviter les artefacts individuels. Avec un seul donneur dominant, l'analyse différentielle sur 'Microglie DAM' aurait été statistiquement invalide (confondre effet pathologique et variation inter-individuelle). </w:t>
+        <w:t xml:space="preserve">Décision méthodologique : Fusion avec le Cluster 5 (Microglie Homéostatique) pour former un macro-type 'Microglie' unifié (n=4 875 noyaux, 15 donneurs avec ≥20 cellules). Justification : L'approche pseudobulk exige un minimum de 5 donneurs par type cellulaire pour garantir des </w:t>
+      </w:r>
+      <w:proofErr w:type="spellStart"/>
+      <w:r>
+        <w:rPr>
+          <w:rFonts w:ascii="Century Gothic" w:eastAsia="Century Gothic" w:hAnsi="Century Gothic" w:cs="Century Gothic"/>
+          <w:color w:val="666666"/>
+          <w:sz w:val="18"/>
+        </w:rPr>
+        <w:t>réplicats</w:t>
+      </w:r>
+      <w:proofErr w:type="spellEnd"/>
+      <w:r>
+        <w:rPr>
+          <w:rFonts w:ascii="Century Gothic" w:eastAsia="Century Gothic" w:hAnsi="Century Gothic" w:cs="Century Gothic"/>
+          <w:color w:val="666666"/>
+          <w:sz w:val="18"/>
+        </w:rPr>
+        <w:t xml:space="preserve"> biologiques suffisants et éviter les artefacts individuels. Avec un seul donneur dominant, l'analyse différentielle sur 'Microglie DAM' aurait été statistiquement invalide (confondre effet pathologique et variation inter-individuelle). </w:t>
       </w:r>
     </w:p>
     <w:p>
@@ -6077,7 +7587,25 @@
           <w:color w:val="666666"/>
           <w:sz w:val="18"/>
         </w:rPr>
-        <w:t>Conséquence biologique : Perte de granularité sur l'état d'activation microglial. Les signatures DAM (inflammation, phagocytose) seront diluées dans le macro-type 'Microglie' unifié, réduisant potentiellement la sensibilité pour détecter des gènes spécifiques à l'activation pathologique.</w:t>
+        <w:t xml:space="preserve">Conséquence biologique : Perte de granularité sur l'état d'activation </w:t>
+      </w:r>
+      <w:proofErr w:type="spellStart"/>
+      <w:r>
+        <w:rPr>
+          <w:rFonts w:ascii="Century Gothic" w:eastAsia="Century Gothic" w:hAnsi="Century Gothic" w:cs="Century Gothic"/>
+          <w:color w:val="666666"/>
+          <w:sz w:val="18"/>
+        </w:rPr>
+        <w:t>microglial</w:t>
+      </w:r>
+      <w:proofErr w:type="spellEnd"/>
+      <w:r>
+        <w:rPr>
+          <w:rFonts w:ascii="Century Gothic" w:eastAsia="Century Gothic" w:hAnsi="Century Gothic" w:cs="Century Gothic"/>
+          <w:color w:val="666666"/>
+          <w:sz w:val="18"/>
+        </w:rPr>
+        <w:t>. Les signatures DAM (inflammation, phagocytose) seront diluées dans le macro-type 'Microglie' unifié, réduisant potentiellement la sensibilité pour détecter des gènes spécifiques à l'activation pathologique.</w:t>
       </w:r>
       <w:r>
         <w:t xml:space="preserve"> </w:t>
@@ -6125,7 +7653,47 @@
         <w:ind w:left="-5" w:right="35"/>
       </w:pPr>
       <w:r>
-        <w:t xml:space="preserve">Les comptages UMI bruts (adata.layers['counts']) ont été agrégés (somme) par combinaison unique de (type_cellulaire, donneur), créant des 'échantillons pseudobulk'. Par exemple, pour le type 'Microglie', les comptages de tous les noyaux microglials du Donor_865 ont été sommés pour créer un échantillon 'Microglia__Donor_865'. Cette agrégation transforme les données single-cell en format bulk, où chaque donneur devient un réplicat biologique indépendant. </w:t>
+        <w:t>Les comptages UMI bruts (</w:t>
+      </w:r>
+      <w:proofErr w:type="spellStart"/>
+      <w:r>
+        <w:t>adata.layers</w:t>
+      </w:r>
+      <w:proofErr w:type="spellEnd"/>
+      <w:r>
+        <w:t>['</w:t>
+      </w:r>
+      <w:proofErr w:type="spellStart"/>
+      <w:r>
+        <w:t>counts</w:t>
+      </w:r>
+      <w:proofErr w:type="spellEnd"/>
+      <w:r>
+        <w:t>']) ont été agrégés (somme) par combinaison unique de (</w:t>
+      </w:r>
+      <w:proofErr w:type="spellStart"/>
+      <w:r>
+        <w:t>type_cellulaire</w:t>
+      </w:r>
+      <w:proofErr w:type="spellEnd"/>
+      <w:r>
+        <w:t xml:space="preserve">, donneur), créant des 'échantillons pseudobulk'. Par exemple, pour le type 'Microglie', les comptages de tous les noyaux </w:t>
+      </w:r>
+      <w:proofErr w:type="spellStart"/>
+      <w:r>
+        <w:t>microglials</w:t>
+      </w:r>
+      <w:proofErr w:type="spellEnd"/>
+      <w:r>
+        <w:t xml:space="preserve"> du Donor_865 ont été sommés pour créer un échantillon 'Microglia__Donor_865'. Cette agrégation transforme les données single-cell en format bulk, où chaque donneur devient un </w:t>
+      </w:r>
+      <w:proofErr w:type="spellStart"/>
+      <w:r>
+        <w:t>réplicat</w:t>
+      </w:r>
+      <w:proofErr w:type="spellEnd"/>
+      <w:r>
+        <w:t xml:space="preserve"> biologique indépendant. </w:t>
       </w:r>
     </w:p>
     <w:p>
@@ -6203,7 +7771,87 @@
         <w:ind w:left="-5" w:right="35"/>
       </w:pPr>
       <w:r>
-        <w:t xml:space="preserve">3. Exclusion manuelle du macro-type 'Unknown/Low Quality' (noyaux de mauvaise qualité, profils dégradés) Résultat final : 96 échantillons pseudobulk couvrant 7 types cellulaires robustes (Excitatory neuron, Inhibitory neuron, Oligodendrocyte/OPC, Astrocyte Homeostatic, Astrocyte Reactive, Microglia, Support/Vascular/Immune). </w:t>
+        <w:t>3. Exclusion manuelle du macro-type '</w:t>
+      </w:r>
+      <w:proofErr w:type="spellStart"/>
+      <w:r>
+        <w:t>Unknown</w:t>
+      </w:r>
+      <w:proofErr w:type="spellEnd"/>
+      <w:r>
+        <w:t xml:space="preserve">/Low </w:t>
+      </w:r>
+      <w:proofErr w:type="spellStart"/>
+      <w:r>
+        <w:t>Quality</w:t>
+      </w:r>
+      <w:proofErr w:type="spellEnd"/>
+      <w:r>
+        <w:t>' (noyaux de mauvaise qualité, profils dégradés) Résultat final : 96 échantillons pseudobulk couvrant 7 types cellulaires robustes (</w:t>
+      </w:r>
+      <w:proofErr w:type="spellStart"/>
+      <w:r>
+        <w:t>Excitatory</w:t>
+      </w:r>
+      <w:proofErr w:type="spellEnd"/>
+      <w:r>
+        <w:t xml:space="preserve"> </w:t>
+      </w:r>
+      <w:proofErr w:type="spellStart"/>
+      <w:r>
+        <w:t>neuron</w:t>
+      </w:r>
+      <w:proofErr w:type="spellEnd"/>
+      <w:r>
+        <w:t xml:space="preserve">, </w:t>
+      </w:r>
+      <w:proofErr w:type="spellStart"/>
+      <w:r>
+        <w:t>Inhibitory</w:t>
+      </w:r>
+      <w:proofErr w:type="spellEnd"/>
+      <w:r>
+        <w:t xml:space="preserve"> </w:t>
+      </w:r>
+      <w:proofErr w:type="spellStart"/>
+      <w:r>
+        <w:t>neuron</w:t>
+      </w:r>
+      <w:proofErr w:type="spellEnd"/>
+      <w:r>
+        <w:t xml:space="preserve">, Oligodendrocyte/OPC, Astrocyte </w:t>
+      </w:r>
+      <w:proofErr w:type="spellStart"/>
+      <w:r>
+        <w:t>Homeostatic</w:t>
+      </w:r>
+      <w:proofErr w:type="spellEnd"/>
+      <w:r>
+        <w:t xml:space="preserve">, Astrocyte </w:t>
+      </w:r>
+      <w:proofErr w:type="spellStart"/>
+      <w:r>
+        <w:t>Reactive</w:t>
+      </w:r>
+      <w:proofErr w:type="spellEnd"/>
+      <w:r>
+        <w:t xml:space="preserve">, </w:t>
+      </w:r>
+      <w:proofErr w:type="spellStart"/>
+      <w:r>
+        <w:t>Microglia</w:t>
+      </w:r>
+      <w:proofErr w:type="spellEnd"/>
+      <w:r>
+        <w:t>, Support/</w:t>
+      </w:r>
+      <w:proofErr w:type="spellStart"/>
+      <w:r>
+        <w:t>Vascular</w:t>
+      </w:r>
+      <w:proofErr w:type="spellEnd"/>
+      <w:r>
+        <w:t xml:space="preserve">/Immune). </w:t>
       </w:r>
     </w:p>
     <w:p>
@@ -6262,8 +7910,21 @@
         <w:rPr>
           <w:lang w:val="en-US"/>
         </w:rPr>
-        <w:lastRenderedPageBreak/>
-        <w:t xml:space="preserve">Expression ~ sex + genetic_ancestry + disease </w:t>
+        <w:t xml:space="preserve">Expression ~ sex + </w:t>
+      </w:r>
+      <w:proofErr w:type="spellStart"/>
+      <w:r>
+        <w:rPr>
+          <w:lang w:val="en-US"/>
+        </w:rPr>
+        <w:t>genetic_ancestry</w:t>
+      </w:r>
+      <w:proofErr w:type="spellEnd"/>
+      <w:r>
+        <w:rPr>
+          <w:lang w:val="en-US"/>
+        </w:rPr>
+        <w:t xml:space="preserve"> + disease </w:t>
       </w:r>
     </w:p>
     <w:p>
@@ -6278,7 +7939,21 @@
         <w:rPr>
           <w:lang w:val="en-US"/>
         </w:rPr>
-        <w:t xml:space="preserve"> où : </w:t>
+        <w:t xml:space="preserve"> </w:t>
+      </w:r>
+      <w:proofErr w:type="spellStart"/>
+      <w:r>
+        <w:rPr>
+          <w:lang w:val="en-US"/>
+        </w:rPr>
+        <w:t>où</w:t>
+      </w:r>
+      <w:proofErr w:type="spellEnd"/>
+      <w:r>
+        <w:rPr>
+          <w:lang w:val="en-US"/>
+        </w:rPr>
+        <w:t xml:space="preserve"> : </w:t>
       </w:r>
     </w:p>
     <w:p>
@@ -6290,8 +7965,29 @@
         <w:spacing w:after="0" w:line="240" w:lineRule="auto"/>
         <w:ind w:right="35" w:hanging="884"/>
       </w:pPr>
-      <w:r>
-        <w:t xml:space="preserve">sex : Sexe biologique (male/female) — covariable d'ajustement </w:t>
+      <w:proofErr w:type="spellStart"/>
+      <w:r>
+        <w:t>sex</w:t>
+      </w:r>
+      <w:proofErr w:type="spellEnd"/>
+      <w:r>
+        <w:t xml:space="preserve"> : Sexe biologique (male/</w:t>
+      </w:r>
+      <w:proofErr w:type="spellStart"/>
+      <w:r>
+        <w:t>female</w:t>
+      </w:r>
+      <w:proofErr w:type="spellEnd"/>
+      <w:r>
+        <w:t xml:space="preserve">) — </w:t>
+      </w:r>
+      <w:proofErr w:type="spellStart"/>
+      <w:r>
+        <w:t>covariable</w:t>
+      </w:r>
+      <w:proofErr w:type="spellEnd"/>
+      <w:r>
+        <w:t xml:space="preserve"> d'ajustement </w:t>
       </w:r>
     </w:p>
     <w:p>
@@ -6303,8 +7999,21 @@
         <w:spacing w:after="0" w:line="240" w:lineRule="auto"/>
         <w:ind w:right="35" w:hanging="884"/>
       </w:pPr>
-      <w:r>
-        <w:t xml:space="preserve">genetic_ancestry : Ascendance génétique (European/East Asian/Asian) — covariable d'ajustement </w:t>
+      <w:proofErr w:type="spellStart"/>
+      <w:r>
+        <w:t>genetic_ancestry</w:t>
+      </w:r>
+      <w:proofErr w:type="spellEnd"/>
+      <w:r>
+        <w:t xml:space="preserve"> : Ascendance génétique (European/East Asian/Asian) — </w:t>
+      </w:r>
+      <w:proofErr w:type="spellStart"/>
+      <w:r>
+        <w:t>covariable</w:t>
+      </w:r>
+      <w:proofErr w:type="spellEnd"/>
+      <w:r>
+        <w:t xml:space="preserve"> d'ajustement </w:t>
       </w:r>
     </w:p>
     <w:p>
@@ -6405,7 +8114,23 @@
         <w:ind w:right="35" w:hanging="884"/>
       </w:pPr>
       <w:r>
-        <w:t xml:space="preserve">p-value ajustée (FDR, méthode Benjamini-Hochberg) : padj &lt; 0,05 </w:t>
+        <w:t xml:space="preserve">p-value ajustée (FDR, méthode </w:t>
+      </w:r>
+      <w:proofErr w:type="spellStart"/>
+      <w:r>
+        <w:t>Benjamini-Hochberg</w:t>
+      </w:r>
+      <w:proofErr w:type="spellEnd"/>
+      <w:r>
+        <w:t xml:space="preserve">) : </w:t>
+      </w:r>
+      <w:proofErr w:type="spellStart"/>
+      <w:r>
+        <w:t>padj</w:t>
+      </w:r>
+      <w:proofErr w:type="spellEnd"/>
+      <w:r>
+        <w:t xml:space="preserve"> &lt; 0,05 </w:t>
       </w:r>
     </w:p>
     <w:p>
@@ -6417,8 +8142,13 @@
         <w:spacing w:after="0" w:line="240" w:lineRule="auto"/>
         <w:ind w:right="35" w:hanging="884"/>
       </w:pPr>
-      <w:r>
-        <w:t xml:space="preserve">Fold-change biologique minimum : |log2FC| &gt; 0,5 (soit FC &gt; 1,41 ou FC &lt; 0,71) </w:t>
+      <w:proofErr w:type="spellStart"/>
+      <w:r>
+        <w:t>Fold</w:t>
+      </w:r>
+      <w:proofErr w:type="spellEnd"/>
+      <w:r>
+        <w:t xml:space="preserve">-change biologique minimum : |log2FC| &gt; 0,5 (soit FC &gt; 1,41 ou FC &lt; 0,71) </w:t>
       </w:r>
     </w:p>
     <w:p>
@@ -6442,15 +8172,71 @@
           <w:color w:val="1A5490"/>
           <w:sz w:val="18"/>
         </w:rPr>
-        <w:t xml:space="preserve"> NOTE PÉDAGOGIQUE - Rôle des covariables d'ajustement dans le modèle DESeq2 </w:t>
-      </w:r>
-      <w:r>
-        <w:rPr>
-          <w:rFonts w:ascii="Century Gothic" w:eastAsia="Century Gothic" w:hAnsi="Century Gothic" w:cs="Century Gothic"/>
+        <w:t xml:space="preserve"> NOTE PÉDAGOGIQUE - Rôle des </w:t>
+      </w:r>
+      <w:proofErr w:type="spellStart"/>
+      <w:r>
+        <w:rPr>
+          <w:rFonts w:ascii="Century Gothic" w:eastAsia="Century Gothic" w:hAnsi="Century Gothic" w:cs="Century Gothic"/>
+          <w:b/>
           <w:color w:val="1A5490"/>
           <w:sz w:val="18"/>
         </w:rPr>
-        <w:t xml:space="preserve">Pourquoi inclure 'sex' et 'genetic_ancestry' dans le modèle ? </w:t>
+        <w:t>covariables</w:t>
+      </w:r>
+      <w:proofErr w:type="spellEnd"/>
+      <w:r>
+        <w:rPr>
+          <w:rFonts w:ascii="Century Gothic" w:eastAsia="Century Gothic" w:hAnsi="Century Gothic" w:cs="Century Gothic"/>
+          <w:b/>
+          <w:color w:val="1A5490"/>
+          <w:sz w:val="18"/>
+        </w:rPr>
+        <w:t xml:space="preserve"> d'ajustement dans le modèle DESeq2 </w:t>
+      </w:r>
+      <w:r>
+        <w:rPr>
+          <w:rFonts w:ascii="Century Gothic" w:eastAsia="Century Gothic" w:hAnsi="Century Gothic" w:cs="Century Gothic"/>
+          <w:color w:val="1A5490"/>
+          <w:sz w:val="18"/>
+        </w:rPr>
+        <w:t>Pourquoi inclure '</w:t>
+      </w:r>
+      <w:proofErr w:type="spellStart"/>
+      <w:r>
+        <w:rPr>
+          <w:rFonts w:ascii="Century Gothic" w:eastAsia="Century Gothic" w:hAnsi="Century Gothic" w:cs="Century Gothic"/>
+          <w:color w:val="1A5490"/>
+          <w:sz w:val="18"/>
+        </w:rPr>
+        <w:t>sex</w:t>
+      </w:r>
+      <w:proofErr w:type="spellEnd"/>
+      <w:r>
+        <w:rPr>
+          <w:rFonts w:ascii="Century Gothic" w:eastAsia="Century Gothic" w:hAnsi="Century Gothic" w:cs="Century Gothic"/>
+          <w:color w:val="1A5490"/>
+          <w:sz w:val="18"/>
+        </w:rPr>
+        <w:t>' et '</w:t>
+      </w:r>
+      <w:proofErr w:type="spellStart"/>
+      <w:r>
+        <w:rPr>
+          <w:rFonts w:ascii="Century Gothic" w:eastAsia="Century Gothic" w:hAnsi="Century Gothic" w:cs="Century Gothic"/>
+          <w:color w:val="1A5490"/>
+          <w:sz w:val="18"/>
+        </w:rPr>
+        <w:t>genetic_ancestry</w:t>
+      </w:r>
+      <w:proofErr w:type="spellEnd"/>
+      <w:r>
+        <w:rPr>
+          <w:rFonts w:ascii="Century Gothic" w:eastAsia="Century Gothic" w:hAnsi="Century Gothic" w:cs="Century Gothic"/>
+          <w:color w:val="1A5490"/>
+          <w:sz w:val="18"/>
+        </w:rPr>
+        <w:t xml:space="preserve">' dans le modèle ? </w:t>
       </w:r>
     </w:p>
     <w:p>
@@ -6480,6 +8266,7 @@
           <w:color w:val="1A5490"/>
           <w:sz w:val="18"/>
         </w:rPr>
+        <w:lastRenderedPageBreak/>
         <w:t xml:space="preserve">Sans ajustement, si les groupes AD et CTRL diffèrent systématiquement en termes de sexe (ex: AD=70% hommes, CTRL=50% hommes), les DEGs identifiés pourraient refléter des différences liées au SEXE plutôt qu'à la PATHOLOGIE. Le modèle DESeq2 'nettoie' statistiquement l'effet du sexe et de l'ascendance AVANT de calculer l'effet de la maladie. On obtient ainsi l'effet 'pur' de AD vs CTRL, indépendant des biais démographiques. </w:t>
       </w:r>
     </w:p>
@@ -6781,7 +8568,15 @@
         <w:ind w:left="-5" w:right="35"/>
       </w:pPr>
       <w:r>
-        <w:t xml:space="preserve">Les résultats quantitatifs présentés ci-dessous (nombres de DEGs, log2FC, padj) sont basés sur une analyse R/DESeq2 complète mais DOIVENT être considérés comme préliminaires. L'interprétation biologique (signatures inflammatoires, dysfonction synaptique) est robuste et cohérente avec la littérature, mais les valeurs numériques exactes sont limitées par la taille réduite de la cohorte, en particulier pour la maladie de Parkinson (PD, n=3). </w:t>
+        <w:t xml:space="preserve">Les résultats quantitatifs présentés ci-dessous (nombres de DEGs, log2FC, </w:t>
+      </w:r>
+      <w:proofErr w:type="spellStart"/>
+      <w:r>
+        <w:t>padj</w:t>
+      </w:r>
+      <w:proofErr w:type="spellEnd"/>
+      <w:r>
+        <w:t xml:space="preserve">) sont basés sur une analyse R/DESeq2 complète mais DOIVENT être considérés comme préliminaires. L'interprétation biologique (signatures inflammatoires, dysfonction synaptique) est robuste et cohérente avec la littérature, mais les valeurs numériques exactes sont limitées par la taille réduite de la cohorte, en particulier pour la maladie de Parkinson (PD, n=3). </w:t>
       </w:r>
     </w:p>
     <w:p>
@@ -6967,12 +8762,21 @@
               <w:ind w:left="0" w:right="0" w:firstLine="0"/>
               <w:jc w:val="left"/>
             </w:pPr>
+            <w:proofErr w:type="spellStart"/>
             <w:r>
               <w:rPr>
                 <w:b/>
                 <w:sz w:val="22"/>
               </w:rPr>
-              <w:t xml:space="preserve">Signif. </w:t>
+              <w:t>Signif</w:t>
+            </w:r>
+            <w:proofErr w:type="spellEnd"/>
+            <w:r>
+              <w:rPr>
+                <w:b/>
+                <w:sz w:val="22"/>
+              </w:rPr>
+              <w:t xml:space="preserve">. </w:t>
             </w:r>
           </w:p>
           <w:p>
@@ -7048,6 +8852,7 @@
               <w:ind w:left="0" w:right="0" w:firstLine="0"/>
               <w:jc w:val="left"/>
             </w:pPr>
+            <w:proofErr w:type="spellStart"/>
             <w:r>
               <w:rPr>
                 <w:b/>
@@ -7055,6 +8860,7 @@
               </w:rPr>
               <w:t>Astrocyte.Homeostatic</w:t>
             </w:r>
+            <w:proofErr w:type="spellEnd"/>
             <w:r>
               <w:rPr>
                 <w:b/>
@@ -7079,12 +8885,14 @@
               <w:spacing w:after="0" w:line="240" w:lineRule="auto"/>
               <w:ind w:left="1" w:right="0" w:firstLine="0"/>
             </w:pPr>
+            <w:proofErr w:type="spellStart"/>
             <w:r>
               <w:rPr>
                 <w:sz w:val="22"/>
               </w:rPr>
               <w:t>AD_vs_CTRL</w:t>
             </w:r>
+            <w:proofErr w:type="spellEnd"/>
             <w:r>
               <w:t xml:space="preserve"> </w:t>
             </w:r>
@@ -7235,6 +9043,7 @@
               <w:ind w:left="0" w:right="0" w:firstLine="0"/>
               <w:jc w:val="left"/>
             </w:pPr>
+            <w:proofErr w:type="spellStart"/>
             <w:r>
               <w:rPr>
                 <w:b/>
@@ -7242,6 +9051,7 @@
               </w:rPr>
               <w:t>Astrocyte.Homeostatic</w:t>
             </w:r>
+            <w:proofErr w:type="spellEnd"/>
             <w:r>
               <w:rPr>
                 <w:b/>
@@ -7265,12 +9075,14 @@
               <w:spacing w:after="0" w:line="240" w:lineRule="auto"/>
               <w:ind w:left="1" w:right="0" w:firstLine="0"/>
             </w:pPr>
+            <w:proofErr w:type="spellStart"/>
             <w:r>
               <w:rPr>
                 <w:sz w:val="22"/>
               </w:rPr>
               <w:t>PD_vs_CTRL</w:t>
             </w:r>
+            <w:proofErr w:type="spellEnd"/>
             <w:r>
               <w:t xml:space="preserve"> </w:t>
             </w:r>
@@ -7418,6 +9230,7 @@
               <w:ind w:left="0" w:right="0" w:firstLine="0"/>
               <w:jc w:val="left"/>
             </w:pPr>
+            <w:proofErr w:type="spellStart"/>
             <w:r>
               <w:rPr>
                 <w:b/>
@@ -7425,6 +9238,7 @@
               </w:rPr>
               <w:t>Astrocyte.Reactive</w:t>
             </w:r>
+            <w:proofErr w:type="spellEnd"/>
             <w:r>
               <w:rPr>
                 <w:b/>
@@ -7449,12 +9263,14 @@
               <w:spacing w:after="0" w:line="240" w:lineRule="auto"/>
               <w:ind w:left="1" w:right="0" w:firstLine="0"/>
             </w:pPr>
+            <w:proofErr w:type="spellStart"/>
             <w:r>
               <w:rPr>
                 <w:sz w:val="22"/>
               </w:rPr>
               <w:t>AD_vs_CTRL</w:t>
             </w:r>
+            <w:proofErr w:type="spellEnd"/>
             <w:r>
               <w:t xml:space="preserve"> </w:t>
             </w:r>
@@ -7605,6 +9421,7 @@
               <w:ind w:left="0" w:right="0" w:firstLine="0"/>
               <w:jc w:val="left"/>
             </w:pPr>
+            <w:proofErr w:type="spellStart"/>
             <w:r>
               <w:rPr>
                 <w:b/>
@@ -7612,6 +9429,7 @@
               </w:rPr>
               <w:t>Excitatory.neuron</w:t>
             </w:r>
+            <w:proofErr w:type="spellEnd"/>
             <w:r>
               <w:rPr>
                 <w:b/>
@@ -7635,12 +9453,14 @@
               <w:spacing w:after="0" w:line="240" w:lineRule="auto"/>
               <w:ind w:left="1" w:right="0" w:firstLine="0"/>
             </w:pPr>
+            <w:proofErr w:type="spellStart"/>
             <w:r>
               <w:rPr>
                 <w:sz w:val="22"/>
               </w:rPr>
               <w:t>AD_vs_CTRL</w:t>
             </w:r>
+            <w:proofErr w:type="spellEnd"/>
             <w:r>
               <w:t xml:space="preserve"> </w:t>
             </w:r>
@@ -7788,6 +9608,7 @@
               <w:ind w:left="0" w:right="0" w:firstLine="0"/>
               <w:jc w:val="left"/>
             </w:pPr>
+            <w:proofErr w:type="spellStart"/>
             <w:r>
               <w:rPr>
                 <w:b/>
@@ -7795,6 +9616,7 @@
               </w:rPr>
               <w:t>Excitatory.neuron</w:t>
             </w:r>
+            <w:proofErr w:type="spellEnd"/>
             <w:r>
               <w:rPr>
                 <w:b/>
@@ -7819,12 +9641,14 @@
               <w:spacing w:after="0" w:line="240" w:lineRule="auto"/>
               <w:ind w:left="1" w:right="0" w:firstLine="0"/>
             </w:pPr>
+            <w:proofErr w:type="spellStart"/>
             <w:r>
               <w:rPr>
                 <w:sz w:val="22"/>
               </w:rPr>
               <w:t>PD_vs_CTRL</w:t>
             </w:r>
+            <w:proofErr w:type="spellEnd"/>
             <w:r>
               <w:t xml:space="preserve"> </w:t>
             </w:r>
@@ -7975,6 +9799,7 @@
               <w:ind w:left="0" w:right="0" w:firstLine="0"/>
               <w:jc w:val="left"/>
             </w:pPr>
+            <w:proofErr w:type="spellStart"/>
             <w:r>
               <w:rPr>
                 <w:b/>
@@ -7982,6 +9807,7 @@
               </w:rPr>
               <w:t>Inhibitory.neuron</w:t>
             </w:r>
+            <w:proofErr w:type="spellEnd"/>
             <w:r>
               <w:rPr>
                 <w:b/>
@@ -8005,12 +9831,14 @@
               <w:spacing w:after="0" w:line="240" w:lineRule="auto"/>
               <w:ind w:left="1" w:right="0" w:firstLine="0"/>
             </w:pPr>
+            <w:proofErr w:type="spellStart"/>
             <w:r>
               <w:rPr>
                 <w:sz w:val="22"/>
               </w:rPr>
               <w:t>AD_vs_CTRL</w:t>
             </w:r>
+            <w:proofErr w:type="spellEnd"/>
             <w:r>
               <w:t xml:space="preserve"> </w:t>
             </w:r>
@@ -8158,6 +9986,7 @@
               <w:ind w:left="0" w:right="0" w:firstLine="0"/>
               <w:jc w:val="left"/>
             </w:pPr>
+            <w:proofErr w:type="spellStart"/>
             <w:r>
               <w:rPr>
                 <w:b/>
@@ -8165,6 +9994,7 @@
               </w:rPr>
               <w:t>Inhibitory.neuron</w:t>
             </w:r>
+            <w:proofErr w:type="spellEnd"/>
             <w:r>
               <w:rPr>
                 <w:b/>
@@ -8189,12 +10019,14 @@
               <w:spacing w:after="0" w:line="240" w:lineRule="auto"/>
               <w:ind w:left="1" w:right="0" w:firstLine="0"/>
             </w:pPr>
+            <w:proofErr w:type="spellStart"/>
             <w:r>
               <w:rPr>
                 <w:sz w:val="22"/>
               </w:rPr>
               <w:t>PD_vs_CTRL</w:t>
             </w:r>
+            <w:proofErr w:type="spellEnd"/>
             <w:r>
               <w:t xml:space="preserve"> </w:t>
             </w:r>
@@ -8345,6 +10177,7 @@
               <w:ind w:left="0" w:right="0" w:firstLine="0"/>
               <w:jc w:val="left"/>
             </w:pPr>
+            <w:proofErr w:type="spellStart"/>
             <w:r>
               <w:rPr>
                 <w:b/>
@@ -8352,6 +10185,7 @@
               </w:rPr>
               <w:t>Microglia</w:t>
             </w:r>
+            <w:proofErr w:type="spellEnd"/>
             <w:r>
               <w:rPr>
                 <w:b/>
@@ -8375,12 +10209,14 @@
               <w:spacing w:after="0" w:line="240" w:lineRule="auto"/>
               <w:ind w:left="1" w:right="0" w:firstLine="0"/>
             </w:pPr>
+            <w:proofErr w:type="spellStart"/>
             <w:r>
               <w:rPr>
                 <w:sz w:val="22"/>
               </w:rPr>
               <w:t>AD_vs_CTRL</w:t>
             </w:r>
+            <w:proofErr w:type="spellEnd"/>
             <w:r>
               <w:t xml:space="preserve"> </w:t>
             </w:r>
@@ -8528,6 +10364,7 @@
               <w:ind w:left="0" w:right="0" w:firstLine="0"/>
               <w:jc w:val="left"/>
             </w:pPr>
+            <w:proofErr w:type="spellStart"/>
             <w:r>
               <w:rPr>
                 <w:b/>
@@ -8535,6 +10372,7 @@
               </w:rPr>
               <w:t>Microglia</w:t>
             </w:r>
+            <w:proofErr w:type="spellEnd"/>
             <w:r>
               <w:rPr>
                 <w:b/>
@@ -8559,12 +10397,14 @@
               <w:spacing w:after="0" w:line="240" w:lineRule="auto"/>
               <w:ind w:left="1" w:right="0" w:firstLine="0"/>
             </w:pPr>
+            <w:proofErr w:type="spellStart"/>
             <w:r>
               <w:rPr>
                 <w:sz w:val="22"/>
               </w:rPr>
               <w:t>PD_vs_CTRL</w:t>
             </w:r>
+            <w:proofErr w:type="spellEnd"/>
             <w:r>
               <w:t xml:space="preserve"> </w:t>
             </w:r>
@@ -8715,6 +10555,7 @@
               <w:ind w:left="0" w:right="0" w:firstLine="0"/>
               <w:jc w:val="left"/>
             </w:pPr>
+            <w:proofErr w:type="spellStart"/>
             <w:r>
               <w:rPr>
                 <w:b/>
@@ -8722,6 +10563,7 @@
               </w:rPr>
               <w:t>Oligodendrocyte.OPC</w:t>
             </w:r>
+            <w:proofErr w:type="spellEnd"/>
             <w:r>
               <w:rPr>
                 <w:b/>
@@ -8745,12 +10587,14 @@
               <w:spacing w:after="0" w:line="240" w:lineRule="auto"/>
               <w:ind w:left="1" w:right="0" w:firstLine="0"/>
             </w:pPr>
+            <w:proofErr w:type="spellStart"/>
             <w:r>
               <w:rPr>
                 <w:sz w:val="22"/>
               </w:rPr>
               <w:t>AD_vs_CTRL</w:t>
             </w:r>
+            <w:proofErr w:type="spellEnd"/>
             <w:r>
               <w:t xml:space="preserve"> </w:t>
             </w:r>
@@ -8898,6 +10742,7 @@
               <w:ind w:left="0" w:right="0" w:firstLine="0"/>
               <w:jc w:val="left"/>
             </w:pPr>
+            <w:proofErr w:type="spellStart"/>
             <w:r>
               <w:rPr>
                 <w:b/>
@@ -8906,6 +10751,7 @@
               <w:lastRenderedPageBreak/>
               <w:t>Oligodendrocyte.OPC</w:t>
             </w:r>
+            <w:proofErr w:type="spellEnd"/>
             <w:r>
               <w:rPr>
                 <w:b/>
@@ -8930,12 +10776,14 @@
               <w:spacing w:after="0" w:line="240" w:lineRule="auto"/>
               <w:ind w:left="1" w:right="0" w:firstLine="0"/>
             </w:pPr>
+            <w:proofErr w:type="spellStart"/>
             <w:r>
               <w:rPr>
                 <w:sz w:val="22"/>
               </w:rPr>
               <w:t>PD_vs_CTRL</w:t>
             </w:r>
+            <w:proofErr w:type="spellEnd"/>
             <w:r>
               <w:t xml:space="preserve"> </w:t>
             </w:r>
@@ -9085,6 +10933,7 @@
               <w:spacing w:after="0" w:line="240" w:lineRule="auto"/>
               <w:ind w:left="0" w:right="0" w:firstLine="0"/>
             </w:pPr>
+            <w:proofErr w:type="spellStart"/>
             <w:r>
               <w:rPr>
                 <w:b/>
@@ -9092,6 +10941,7 @@
               </w:rPr>
               <w:t>Support.Vascular.Immune</w:t>
             </w:r>
+            <w:proofErr w:type="spellEnd"/>
             <w:r>
               <w:rPr>
                 <w:b/>
@@ -9115,12 +10965,14 @@
               <w:spacing w:after="0" w:line="240" w:lineRule="auto"/>
               <w:ind w:left="1" w:right="0" w:firstLine="0"/>
             </w:pPr>
+            <w:proofErr w:type="spellStart"/>
             <w:r>
               <w:rPr>
                 <w:sz w:val="22"/>
               </w:rPr>
               <w:t>AD_vs_CTRL</w:t>
             </w:r>
+            <w:proofErr w:type="spellEnd"/>
             <w:r>
               <w:t xml:space="preserve"> </w:t>
             </w:r>
@@ -9267,6 +11119,7 @@
               <w:spacing w:after="0" w:line="240" w:lineRule="auto"/>
               <w:ind w:left="0" w:right="0" w:firstLine="0"/>
             </w:pPr>
+            <w:proofErr w:type="spellStart"/>
             <w:r>
               <w:rPr>
                 <w:b/>
@@ -9274,6 +11127,7 @@
               </w:rPr>
               <w:t>Support.Vascular.Immune</w:t>
             </w:r>
+            <w:proofErr w:type="spellEnd"/>
             <w:r>
               <w:rPr>
                 <w:b/>
@@ -9298,12 +11152,14 @@
               <w:spacing w:after="0" w:line="240" w:lineRule="auto"/>
               <w:ind w:left="1" w:right="0" w:firstLine="0"/>
             </w:pPr>
+            <w:proofErr w:type="spellStart"/>
             <w:r>
               <w:rPr>
                 <w:sz w:val="22"/>
               </w:rPr>
               <w:t>PD_vs_CTRL</w:t>
             </w:r>
+            <w:proofErr w:type="spellEnd"/>
             <w:r>
               <w:t xml:space="preserve"> </w:t>
             </w:r>
@@ -9480,7 +11336,15 @@
         <w:ind w:right="35"/>
       </w:pPr>
       <w:r>
-        <w:t xml:space="preserve">Le cluster Support/Vascular/Immune présente le signal le plus robuste, avec au moins un gène significatif (FDR&lt;0,05) et plusieurs gènes en forte tendance (P&lt;0,01), suggérant une perturbation de la barrière hémato-encéphalique et de l'environnement vasculaire dans l'AD. • La microglie montre un ensemble de gènes en tendance mais aucun gène ne franchit le seuil de FDR&lt;0,05 dans cette cohorte réduite, illustrant la forte hétérogénéité inter-individuelle des réponses inflammatoires. </w:t>
+        <w:t>Le cluster Support/</w:t>
+      </w:r>
+      <w:proofErr w:type="spellStart"/>
+      <w:r>
+        <w:t>Vascular</w:t>
+      </w:r>
+      <w:proofErr w:type="spellEnd"/>
+      <w:r>
+        <w:t xml:space="preserve">/Immune présente le signal le plus robuste, avec au moins un gène significatif (FDR&lt;0,05) et plusieurs gènes en forte tendance (P&lt;0,01), suggérant une perturbation de la barrière hémato-encéphalique et de l'environnement vasculaire dans l'AD. • La microglie montre un ensemble de gènes en tendance mais aucun gène ne franchit le seuil de FDR&lt;0,05 dans cette cohorte réduite, illustrant la forte hétérogénéité inter-individuelle des réponses inflammatoires. </w:t>
       </w:r>
     </w:p>
     <w:p>
@@ -9555,7 +11419,55 @@
           <w:i/>
           <w:sz w:val="20"/>
         </w:rPr>
-        <w:t>Figure 12. Volcano plot du cluster Support/Vascular/Immune (AD vs CTRL). Le point rouge identifie le lncRNA MEG3 significativement sous-exprimé (FDR &lt; 0,05), tandis que les points oranges (P &lt; 0,01) correspondent à des gènes montrant une forte tendance biologique.</w:t>
+        <w:t xml:space="preserve">Figure 12. </w:t>
+      </w:r>
+      <w:proofErr w:type="spellStart"/>
+      <w:r>
+        <w:rPr>
+          <w:i/>
+          <w:sz w:val="20"/>
+        </w:rPr>
+        <w:t>Volcano</w:t>
+      </w:r>
+      <w:proofErr w:type="spellEnd"/>
+      <w:r>
+        <w:rPr>
+          <w:i/>
+          <w:sz w:val="20"/>
+        </w:rPr>
+        <w:t xml:space="preserve"> plot du cluster Support/</w:t>
+      </w:r>
+      <w:proofErr w:type="spellStart"/>
+      <w:r>
+        <w:rPr>
+          <w:i/>
+          <w:sz w:val="20"/>
+        </w:rPr>
+        <w:t>Vascular</w:t>
+      </w:r>
+      <w:proofErr w:type="spellEnd"/>
+      <w:r>
+        <w:rPr>
+          <w:i/>
+          <w:sz w:val="20"/>
+        </w:rPr>
+        <w:t xml:space="preserve">/Immune (AD vs CTRL). Le point rouge identifie le </w:t>
+      </w:r>
+      <w:proofErr w:type="spellStart"/>
+      <w:r>
+        <w:rPr>
+          <w:i/>
+          <w:sz w:val="20"/>
+        </w:rPr>
+        <w:t>lncRNA</w:t>
+      </w:r>
+      <w:proofErr w:type="spellEnd"/>
+      <w:r>
+        <w:rPr>
+          <w:i/>
+          <w:sz w:val="20"/>
+        </w:rPr>
+        <w:t xml:space="preserve"> MEG3 significativement sous-exprimé (FDR &lt; 0,05), tandis que les points oranges (P &lt; 0,01) correspondent à des gènes montrant une forte tendance biologique.</w:t>
       </w:r>
       <w:r>
         <w:t xml:space="preserve"> </w:t>
@@ -9621,7 +11533,23 @@
           <w:i/>
           <w:sz w:val="20"/>
         </w:rPr>
-        <w:t>Figure 13. Top 15 des gènes les plus dérégulés (|log2FC|) dans le cluster Support/Vascular/Immune (AD vs CTRL). Les barres rouges indiquent les gènes surexprimés, les barres bleues ceux sous-exprimés, avec MEG3 parmi les gènes les plus fortement diminués.</w:t>
+        <w:t>Figure 13. Top 15 des gènes les plus dérégulés (|log2FC|) dans le cluster Support/</w:t>
+      </w:r>
+      <w:proofErr w:type="spellStart"/>
+      <w:r>
+        <w:rPr>
+          <w:i/>
+          <w:sz w:val="20"/>
+        </w:rPr>
+        <w:t>Vascular</w:t>
+      </w:r>
+      <w:proofErr w:type="spellEnd"/>
+      <w:r>
+        <w:rPr>
+          <w:i/>
+          <w:sz w:val="20"/>
+        </w:rPr>
+        <w:t>/Immune (AD vs CTRL). Les barres rouges indiquent les gènes surexprimés, les barres bleues ceux sous-exprimés, avec MEG3 parmi les gènes les plus fortement diminués.</w:t>
       </w:r>
       <w:r>
         <w:t xml:space="preserve"> </w:t>
@@ -9748,7 +11676,23 @@
           <w:i/>
           <w:sz w:val="20"/>
         </w:rPr>
-        <w:t>Figure 14. Volcano plot de l'analyse différentielle Microglie (AD vs CTRL). L'absence de points rouges (FDR&lt;0,05) illustre la faible puissance statistique et l'hétérogénéité inter-individuelle, tandis que la zone orange (P&lt;0,01) met en évidence un ensemble de gènes candidats potentiellement impliqués dans la réponse microgliale.</w:t>
+        <w:t xml:space="preserve">Figure 14. </w:t>
+      </w:r>
+      <w:proofErr w:type="spellStart"/>
+      <w:r>
+        <w:rPr>
+          <w:i/>
+          <w:sz w:val="20"/>
+        </w:rPr>
+        <w:t>Volcano</w:t>
+      </w:r>
+      <w:proofErr w:type="spellEnd"/>
+      <w:r>
+        <w:rPr>
+          <w:i/>
+          <w:sz w:val="20"/>
+        </w:rPr>
+        <w:t xml:space="preserve"> plot de l'analyse différentielle Microglie (AD vs CTRL). L'absence de points rouges (FDR&lt;0,05) illustre la faible puissance statistique et l'hétérogénéité inter-individuelle, tandis que la zone orange (P&lt;0,01) met en évidence un ensemble de gènes candidats potentiellement impliqués dans la réponse microgliale.</w:t>
       </w:r>
       <w:r>
         <w:t xml:space="preserve"> </w:t>
@@ -9767,7 +11711,27 @@
           <w:color w:val="FF8C00"/>
           <w:sz w:val="22"/>
         </w:rPr>
-        <w:t>[FIGURE 15 À INSÉRER : Heatmap Top DEGs neuronaux]</w:t>
+        <w:t xml:space="preserve">[FIGURE 15 À INSÉRER : </w:t>
+      </w:r>
+      <w:proofErr w:type="spellStart"/>
+      <w:r>
+        <w:rPr>
+          <w:b/>
+          <w:i/>
+          <w:color w:val="FF8C00"/>
+          <w:sz w:val="22"/>
+        </w:rPr>
+        <w:t>Heatmap</w:t>
+      </w:r>
+      <w:proofErr w:type="spellEnd"/>
+      <w:r>
+        <w:rPr>
+          <w:b/>
+          <w:i/>
+          <w:color w:val="FF8C00"/>
+          <w:sz w:val="22"/>
+        </w:rPr>
+        <w:t xml:space="preserve"> Top DEGs neuronaux]</w:t>
       </w:r>
       <w:r>
         <w:t xml:space="preserve"> </w:t>
@@ -9822,7 +11786,23 @@
         <w:ind w:right="35"/>
       </w:pPr>
       <w:r>
-        <w:t xml:space="preserve">Neuroinflammation vasculaire et microgliale : La dérégulation du lncRNA MEG3 dans les cellules Support/Vascular/Immune, associée à des gènes en tendance impliqués dans l'angiogenèse et l'activation endothéliale, suggère une altération de la barrière hématoencéphalique. En parallèle, la microglie montre un ensemble de gènes candidats compatibles avec une activation inflammatoire hétérogène, bien que la plupart ne franchissent pas le seuil de </w:t>
+        <w:t xml:space="preserve">Neuroinflammation vasculaire et microgliale : La dérégulation du </w:t>
+      </w:r>
+      <w:proofErr w:type="spellStart"/>
+      <w:r>
+        <w:t>lncRNA</w:t>
+      </w:r>
+      <w:proofErr w:type="spellEnd"/>
+      <w:r>
+        <w:t xml:space="preserve"> MEG3 dans les cellules Support/</w:t>
+      </w:r>
+      <w:proofErr w:type="spellStart"/>
+      <w:r>
+        <w:t>Vascular</w:t>
+      </w:r>
+      <w:proofErr w:type="spellEnd"/>
+      <w:r>
+        <w:t xml:space="preserve">/Immune, associée à des gènes en tendance impliqués dans l'angiogenèse et l'activation endothéliale, suggère une altération de la barrière hématoencéphalique. En parallèle, la microglie montre un ensemble de gènes candidats compatibles avec une activation inflammatoire hétérogène, bien que la plupart ne franchissent pas le seuil de </w:t>
       </w:r>
     </w:p>
     <w:p>
@@ -9980,7 +11960,15 @@
         <w:ind w:right="35"/>
       </w:pPr>
       <w:r>
-        <w:t xml:space="preserve">Risque de biais moléculaire : Les variants génétiques influençant l'expression génique (eQTLs) diffèrent entre populations. Les polymorphismes de APOE (notamment la fréquence réduite de l'allèle APOE4 en Afrique subsaharienne) pourraient moduler différemment les signatures inflammatoires et vasculaires. </w:t>
+        <w:t>Risque de biais moléculaire : Les variants génétiques influençant l'expression génique (</w:t>
+      </w:r>
+      <w:proofErr w:type="spellStart"/>
+      <w:r>
+        <w:t>eQTLs</w:t>
+      </w:r>
+      <w:proofErr w:type="spellEnd"/>
+      <w:r>
+        <w:t xml:space="preserve">) diffèrent entre populations. Les polymorphismes de APOE (notamment la fréquence réduite de l'allèle APOE4 en Afrique subsaharienne) pourraient moduler différemment les signatures inflammatoires et vasculaires. </w:t>
       </w:r>
     </w:p>
     <w:p>
@@ -10003,7 +11991,23 @@
         <w:ind w:right="35" w:hanging="796"/>
       </w:pPr>
       <w:r>
-        <w:t xml:space="preserve">Puissance statistique insuffisante pour PD (n=3 donneurs vs n=8 AD, n=6 CTRL) : Avec seulement 3 réplicats biologiques, le risque de faux négatifs (Type II error) est élevé. Les effets biologiques de magnitude modérée ne peuvent être détectés de manière fiable. L'absence de DEGs significatifs dans certains types cellulaires pour PD vs CTRL ne peut donc pas être interprétée comme 'absence d'effet', mais comme 'manque de puissance'. </w:t>
+        <w:t xml:space="preserve">Puissance statistique insuffisante pour PD (n=3 donneurs vs n=8 AD, n=6 CTRL) : Avec seulement 3 </w:t>
+      </w:r>
+      <w:proofErr w:type="spellStart"/>
+      <w:r>
+        <w:t>réplicats</w:t>
+      </w:r>
+      <w:proofErr w:type="spellEnd"/>
+      <w:r>
+        <w:t xml:space="preserve"> biologiques, le risque de faux négatifs (Type II </w:t>
+      </w:r>
+      <w:proofErr w:type="spellStart"/>
+      <w:r>
+        <w:t>error</w:t>
+      </w:r>
+      <w:proofErr w:type="spellEnd"/>
+      <w:r>
+        <w:t xml:space="preserve">) est élevé. Les effets biologiques de magnitude modérée ne peuvent être détectés de manière fiable. L'absence de DEGs significatifs dans certains types cellulaires pour PD vs CTRL ne peut donc pas être interprétée comme 'absence d'effet', mais comme 'manque de puissance'. </w:t>
       </w:r>
     </w:p>
     <w:p>
@@ -10026,7 +12030,15 @@
         <w:ind w:right="35" w:hanging="796"/>
       </w:pPr>
       <w:r>
-        <w:t xml:space="preserve">Métadonnées cliniques manquantes (âge, PMI, stade pathologique, génotype APOE) : L'absence de ces covariables empêche de distinguer l'effet de la pathologie de celui du vieillissement ou d'autres facteurs confondants majeurs. </w:t>
+        <w:t xml:space="preserve">Métadonnées cliniques manquantes (âge, PMI, stade pathologique, génotype APOE) : L'absence de ces </w:t>
+      </w:r>
+      <w:proofErr w:type="spellStart"/>
+      <w:r>
+        <w:t>covariables</w:t>
+      </w:r>
+      <w:proofErr w:type="spellEnd"/>
+      <w:r>
+        <w:t xml:space="preserve"> empêche de distinguer l'effet de la pathologie de celui du vieillissement ou d'autres facteurs confondants majeurs. </w:t>
       </w:r>
     </w:p>
     <w:p>
@@ -10125,7 +12137,25 @@
           <w:color w:val="666666"/>
           <w:sz w:val="18"/>
         </w:rPr>
-        <w:t>L'âge est LE facteur de risque majeur pour AD et PD. En l'absence de la variable 'age_at_death' dans les métadonnées, il est impossible d'ajuster explicitement pour ce facteur dans le modèle DESeq2. Par conséquent, les signatures identifiées doivent être interprétées comme des associations plutôt que comme des preuves causales strictes. Une validation sur des cohortes disposant d'informations cliniques complètes (ROSMAP, ADNI) sera nécessaire pour raffiner ces conclusions.</w:t>
+        <w:t>L'âge est LE facteur de risque majeur pour AD et PD. En l'absence de la variable '</w:t>
+      </w:r>
+      <w:proofErr w:type="spellStart"/>
+      <w:r>
+        <w:rPr>
+          <w:rFonts w:ascii="Century Gothic" w:eastAsia="Century Gothic" w:hAnsi="Century Gothic" w:cs="Century Gothic"/>
+          <w:color w:val="666666"/>
+          <w:sz w:val="18"/>
+        </w:rPr>
+        <w:t>age_at_death</w:t>
+      </w:r>
+      <w:proofErr w:type="spellEnd"/>
+      <w:r>
+        <w:rPr>
+          <w:rFonts w:ascii="Century Gothic" w:eastAsia="Century Gothic" w:hAnsi="Century Gothic" w:cs="Century Gothic"/>
+          <w:color w:val="666666"/>
+          <w:sz w:val="18"/>
+        </w:rPr>
+        <w:t>' dans les métadonnées, il est impossible d'ajuster explicitement pour ce facteur dans le modèle DESeq2. Par conséquent, les signatures identifiées doivent être interprétées comme des associations plutôt que comme des preuves causales strictes. Une validation sur des cohortes disposant d'informations cliniques complètes (ROSMAP, ADNI) sera nécessaire pour raffiner ces conclusions.</w:t>
       </w:r>
       <w:r>
         <w:t xml:space="preserve"> </w:t>
@@ -10171,7 +12201,15 @@
       </w:pPr>
       <w:r>
         <w:lastRenderedPageBreak/>
-        <w:t xml:space="preserve">Analyse de sous-types cellulaires fins (high-resolution clustering), notamment pour les neurones excitateurs et la microglie, afin d'identifier les populations les plus vulnérables. </w:t>
+        <w:t>Analyse de sous-types cellulaires fins (high-</w:t>
+      </w:r>
+      <w:proofErr w:type="spellStart"/>
+      <w:r>
+        <w:t>resolution</w:t>
+      </w:r>
+      <w:proofErr w:type="spellEnd"/>
+      <w:r>
+        <w:t xml:space="preserve"> clustering), notamment pour les neurones excitateurs et la microglie, afin d'identifier les populations les plus vulnérables. </w:t>
       </w:r>
     </w:p>
     <w:p>
@@ -10194,7 +12232,23 @@
         <w:ind w:right="35"/>
       </w:pPr>
       <w:r>
-        <w:t xml:space="preserve">Analyse de trajectoires temporelles (pseudotime, RNA velocity) pour reconstruire les trajectoires d'activation microgliale et la transition d'états neuronaux. </w:t>
+        <w:t>Analyse de trajectoires temporelles (</w:t>
+      </w:r>
+      <w:proofErr w:type="spellStart"/>
+      <w:r>
+        <w:t>pseudotime</w:t>
+      </w:r>
+      <w:proofErr w:type="spellEnd"/>
+      <w:r>
+        <w:t xml:space="preserve">, RNA </w:t>
+      </w:r>
+      <w:proofErr w:type="spellStart"/>
+      <w:r>
+        <w:t>velocity</w:t>
+      </w:r>
+      <w:proofErr w:type="spellEnd"/>
+      <w:r>
+        <w:t xml:space="preserve">) pour reconstruire les trajectoires d'activation microgliale et la transition d'états neuronaux. </w:t>
       </w:r>
     </w:p>
     <w:p>
@@ -10217,7 +12271,23 @@
         <w:ind w:right="35"/>
       </w:pPr>
       <w:r>
-        <w:t xml:space="preserve">Intégration multi-omique (protéomique, épigénomique, spatial transcriptomics) pour valider et contextualiser les signatures observées. </w:t>
+        <w:t xml:space="preserve">Intégration multi-omique (protéomique, </w:t>
+      </w:r>
+      <w:proofErr w:type="spellStart"/>
+      <w:r>
+        <w:t>épigénomique</w:t>
+      </w:r>
+      <w:proofErr w:type="spellEnd"/>
+      <w:r>
+        <w:t xml:space="preserve">, spatial </w:t>
+      </w:r>
+      <w:proofErr w:type="spellStart"/>
+      <w:r>
+        <w:t>transcriptomics</w:t>
+      </w:r>
+      <w:proofErr w:type="spellEnd"/>
+      <w:r>
+        <w:t xml:space="preserve">) pour valider et contextualiser les signatures observées. </w:t>
       </w:r>
     </w:p>
     <w:p>
@@ -10240,7 +12310,31 @@
         <w:ind w:right="35"/>
       </w:pPr>
       <w:r>
-        <w:t xml:space="preserve">Analyse de réseaux de co-expression génique (WGCNA, hdWGCNA) pour identifier des modules de gènes et des hub genes susceptibles de constituer des cibles thérapeutiques privilégiées. </w:t>
+        <w:t xml:space="preserve">Analyse de réseaux de </w:t>
+      </w:r>
+      <w:proofErr w:type="spellStart"/>
+      <w:r>
+        <w:t>co</w:t>
+      </w:r>
+      <w:proofErr w:type="spellEnd"/>
+      <w:r>
+        <w:t xml:space="preserve">-expression génique (WGCNA, </w:t>
+      </w:r>
+      <w:proofErr w:type="spellStart"/>
+      <w:r>
+        <w:t>hdWGCNA</w:t>
+      </w:r>
+      <w:proofErr w:type="spellEnd"/>
+      <w:r>
+        <w:t xml:space="preserve">) pour identifier des modules de gènes et des hub </w:t>
+      </w:r>
+      <w:proofErr w:type="spellStart"/>
+      <w:r>
+        <w:t>genes</w:t>
+      </w:r>
+      <w:proofErr w:type="spellEnd"/>
+      <w:r>
+        <w:t xml:space="preserve"> susceptibles de constituer des cibles thérapeutiques privilégiées. </w:t>
       </w:r>
     </w:p>
     <w:p>
@@ -10310,28 +12404,76 @@
       </w:r>
       <w:r>
         <w:br/>
-        <w:t>1. Analyse de sous-types cellulaires fins (high-resolution clustering), notamment pour identifier les sous-populations de microglies (ex: états prolifératifs vs inflammatoires) invisibles au niveau macro-type.</w:t>
+        <w:t>1. Analyse de sous-types cellulaires fins (high-</w:t>
+      </w:r>
+      <w:proofErr w:type="spellStart"/>
+      <w:r>
+        <w:t>resolution</w:t>
+      </w:r>
+      <w:proofErr w:type="spellEnd"/>
+      <w:r>
+        <w:t xml:space="preserve"> clustering), notamment pour identifier les sous-populations de microglies (ex: états prolifératifs vs inflammatoires) invisibles au niveau macro-type.</w:t>
       </w:r>
       <w:r>
         <w:br/>
       </w:r>
       <w:r>
         <w:br/>
-        <w:t>2. Analyse de trajectoires temporelles (Pseudotime / RNA Velocity) pour reconstruire la dynamique d'activation microgliale et la transition progressive des états neuronaux.</w:t>
+        <w:t>2. Analyse de trajectoires temporelles (</w:t>
+      </w:r>
+      <w:proofErr w:type="spellStart"/>
+      <w:r>
+        <w:t>Pseudotime</w:t>
+      </w:r>
+      <w:proofErr w:type="spellEnd"/>
+      <w:r>
+        <w:t xml:space="preserve"> / RNA Velocity) pour reconstruire la dynamique d'activation microgliale et la transition progressive des états neuronaux.</w:t>
       </w:r>
       <w:r>
         <w:br/>
       </w:r>
       <w:r>
         <w:br/>
-        <w:t>3. Intégration multi-omique : Croisement avec des données d'épigénomique (ATAC-seq) pour valider les facteurs de transcription candidats (ex: POU3F2) identifiés dans nos tendances.</w:t>
+        <w:t>3. Intégration multi-omique : Croisement avec des données d'</w:t>
+      </w:r>
+      <w:proofErr w:type="spellStart"/>
+      <w:r>
+        <w:t>épigénomique</w:t>
+      </w:r>
+      <w:proofErr w:type="spellEnd"/>
+      <w:r>
+        <w:t xml:space="preserve"> (ATAC-seq) pour valider les facteurs de transcription candidats (ex: POU3F2) identifiés dans nos tendances.</w:t>
       </w:r>
       <w:r>
         <w:br/>
       </w:r>
       <w:r>
         <w:br/>
-        <w:t>4. Analyse de réseaux de co-expression (WGCNA) pour identifier des modules de gènes co-régulés et des 'hub genes' potentiels cibles thérapeutiques.</w:t>
+        <w:t xml:space="preserve">4. Analyse de réseaux de </w:t>
+      </w:r>
+      <w:proofErr w:type="spellStart"/>
+      <w:r>
+        <w:t>co</w:t>
+      </w:r>
+      <w:proofErr w:type="spellEnd"/>
+      <w:r>
+        <w:t xml:space="preserve">-expression (WGCNA) pour identifier des modules de gènes </w:t>
+      </w:r>
+      <w:proofErr w:type="spellStart"/>
+      <w:r>
+        <w:t>co-régulés</w:t>
+      </w:r>
+      <w:proofErr w:type="spellEnd"/>
+      <w:r>
+        <w:t xml:space="preserve"> et des 'hub </w:t>
+      </w:r>
+      <w:proofErr w:type="spellStart"/>
+      <w:r>
+        <w:t>genes</w:t>
+      </w:r>
+      <w:proofErr w:type="spellEnd"/>
+      <w:r>
+        <w:t>' potentiels cibles thérapeutiques.</w:t>
       </w:r>
     </w:p>
     <w:p>
@@ -10391,7 +12533,43 @@
           <w:sz w:val="18"/>
         </w:rPr>
         <w:br/>
-        <w:t>Perspective prioritaire : Une stratégie de 'Balanced Subsampling' (ex: 500 cellules/donneur) aurait permis d'inclure plus de 100 donneurs (y compris la cohorte africaine et les cas mixtes) dans la même mémoire RAM. Cette approche sacrifierait la résolution des sous-types rares pour gagner massivement en puissance statistique.</w:t>
+        <w:t>Perspective prioritaire : Une stratégie de '</w:t>
+      </w:r>
+      <w:proofErr w:type="spellStart"/>
+      <w:r>
+        <w:rPr>
+          <w:rFonts w:ascii="Century Gothic" w:hAnsi="Century Gothic"/>
+          <w:color w:val="7030A0"/>
+          <w:sz w:val="18"/>
+        </w:rPr>
+        <w:t>Balanced</w:t>
+      </w:r>
+      <w:proofErr w:type="spellEnd"/>
+      <w:r>
+        <w:rPr>
+          <w:rFonts w:ascii="Century Gothic" w:hAnsi="Century Gothic"/>
+          <w:color w:val="7030A0"/>
+          <w:sz w:val="18"/>
+        </w:rPr>
+        <w:t xml:space="preserve"> </w:t>
+      </w:r>
+      <w:proofErr w:type="spellStart"/>
+      <w:r>
+        <w:rPr>
+          <w:rFonts w:ascii="Century Gothic" w:hAnsi="Century Gothic"/>
+          <w:color w:val="7030A0"/>
+          <w:sz w:val="18"/>
+        </w:rPr>
+        <w:t>Subsampling</w:t>
+      </w:r>
+      <w:proofErr w:type="spellEnd"/>
+      <w:r>
+        <w:rPr>
+          <w:rFonts w:ascii="Century Gothic" w:hAnsi="Century Gothic"/>
+          <w:color w:val="7030A0"/>
+          <w:sz w:val="18"/>
+        </w:rPr>
+        <w:t>' (ex: 500 cellules/donneur) aurait permis d'inclure plus de 100 donneurs (y compris la cohorte africaine et les cas mixtes) dans la même mémoire RAM. Cette approche sacrifierait la résolution des sous-types rares pour gagner massivement en puissance statistique.</w:t>
       </w:r>
     </w:p>
     <w:p>
@@ -10511,7 +12689,43 @@
           <w:color w:val="7030A0"/>
           <w:sz w:val="18"/>
         </w:rPr>
-        <w:t>**Stratégie A : Balanced Subsampling (500 cellules/donneur)**</w:t>
+        <w:t xml:space="preserve">**Stratégie A : </w:t>
+      </w:r>
+      <w:proofErr w:type="spellStart"/>
+      <w:r>
+        <w:rPr>
+          <w:rFonts w:ascii="Century Gothic" w:hAnsi="Century Gothic"/>
+          <w:color w:val="7030A0"/>
+          <w:sz w:val="18"/>
+        </w:rPr>
+        <w:t>Balanced</w:t>
+      </w:r>
+      <w:proofErr w:type="spellEnd"/>
+      <w:r>
+        <w:rPr>
+          <w:rFonts w:ascii="Century Gothic" w:hAnsi="Century Gothic"/>
+          <w:color w:val="7030A0"/>
+          <w:sz w:val="18"/>
+        </w:rPr>
+        <w:t xml:space="preserve"> </w:t>
+      </w:r>
+      <w:proofErr w:type="spellStart"/>
+      <w:r>
+        <w:rPr>
+          <w:rFonts w:ascii="Century Gothic" w:hAnsi="Century Gothic"/>
+          <w:color w:val="7030A0"/>
+          <w:sz w:val="18"/>
+        </w:rPr>
+        <w:t>Subsampling</w:t>
+      </w:r>
+      <w:proofErr w:type="spellEnd"/>
+      <w:r>
+        <w:rPr>
+          <w:rFonts w:ascii="Century Gothic" w:hAnsi="Century Gothic"/>
+          <w:color w:val="7030A0"/>
+          <w:sz w:val="18"/>
+        </w:rPr>
+        <w:t xml:space="preserve"> (500 cellules/donneur)**</w:t>
       </w:r>
     </w:p>
     <w:p>
@@ -10592,7 +12806,25 @@
           <w:color w:val="7030A0"/>
           <w:sz w:val="18"/>
         </w:rPr>
-        <w:t xml:space="preserve">  - Perte des types cellulaires rares (Astrocytes Reactive, OPC) par sous-échantillonnage</w:t>
+        <w:t xml:space="preserve">  - Perte des types cellulaires rares (Astrocytes </w:t>
+      </w:r>
+      <w:proofErr w:type="spellStart"/>
+      <w:r>
+        <w:rPr>
+          <w:rFonts w:ascii="Century Gothic" w:hAnsi="Century Gothic"/>
+          <w:color w:val="7030A0"/>
+          <w:sz w:val="18"/>
+        </w:rPr>
+        <w:t>Reactive</w:t>
+      </w:r>
+      <w:proofErr w:type="spellEnd"/>
+      <w:r>
+        <w:rPr>
+          <w:rFonts w:ascii="Century Gothic" w:hAnsi="Century Gothic"/>
+          <w:color w:val="7030A0"/>
+          <w:sz w:val="18"/>
+        </w:rPr>
+        <w:t>, OPC) par sous-échantillonnage</w:t>
       </w:r>
     </w:p>
     <w:p>
@@ -10632,7 +12864,25 @@
           <w:color w:val="7030A0"/>
           <w:sz w:val="18"/>
         </w:rPr>
-        <w:t xml:space="preserve">  - Inclusion obligatoire de cas mixtes (AD+diabète, AD+PD) compromettant l'interprétation biologique</w:t>
+        <w:t xml:space="preserve">  - Inclusion obligatoire de cas mixtes (</w:t>
+      </w:r>
+      <w:proofErr w:type="spellStart"/>
+      <w:r>
+        <w:rPr>
+          <w:rFonts w:ascii="Century Gothic" w:hAnsi="Century Gothic"/>
+          <w:color w:val="7030A0"/>
+          <w:sz w:val="18"/>
+        </w:rPr>
+        <w:t>AD+diabète</w:t>
+      </w:r>
+      <w:proofErr w:type="spellEnd"/>
+      <w:r>
+        <w:rPr>
+          <w:rFonts w:ascii="Century Gothic" w:hAnsi="Century Gothic"/>
+          <w:color w:val="7030A0"/>
+          <w:sz w:val="18"/>
+        </w:rPr>
+        <w:t>, AD+PD) compromettant l'interprétation biologique</w:t>
       </w:r>
     </w:p>
     <w:p>
@@ -10824,7 +13074,43 @@
           <w:color w:val="7030A0"/>
           <w:sz w:val="18"/>
         </w:rPr>
-        <w:t xml:space="preserve">  - Ajout d'une covariable confondante (ancestry) complexifiant le modèle statistique</w:t>
+        <w:t xml:space="preserve">  - Ajout d'une </w:t>
+      </w:r>
+      <w:proofErr w:type="spellStart"/>
+      <w:r>
+        <w:rPr>
+          <w:rFonts w:ascii="Century Gothic" w:hAnsi="Century Gothic"/>
+          <w:color w:val="7030A0"/>
+          <w:sz w:val="18"/>
+        </w:rPr>
+        <w:t>covariable</w:t>
+      </w:r>
+      <w:proofErr w:type="spellEnd"/>
+      <w:r>
+        <w:rPr>
+          <w:rFonts w:ascii="Century Gothic" w:hAnsi="Century Gothic"/>
+          <w:color w:val="7030A0"/>
+          <w:sz w:val="18"/>
+        </w:rPr>
+        <w:t xml:space="preserve"> confondante (</w:t>
+      </w:r>
+      <w:proofErr w:type="spellStart"/>
+      <w:r>
+        <w:rPr>
+          <w:rFonts w:ascii="Century Gothic" w:hAnsi="Century Gothic"/>
+          <w:color w:val="7030A0"/>
+          <w:sz w:val="18"/>
+        </w:rPr>
+        <w:t>ancestry</w:t>
+      </w:r>
+      <w:proofErr w:type="spellEnd"/>
+      <w:r>
+        <w:rPr>
+          <w:rFonts w:ascii="Century Gothic" w:hAnsi="Century Gothic"/>
+          <w:color w:val="7030A0"/>
+          <w:sz w:val="18"/>
+        </w:rPr>
+        <w:t>) complexifiant le modèle statistique</w:t>
       </w:r>
     </w:p>
     <w:p>
@@ -10908,7 +13194,25 @@
           <w:color w:val="7030A0"/>
           <w:sz w:val="18"/>
         </w:rPr>
-        <w:t>Les deux alternatives présentaient des limitations rédhibitoires. La stratégie actuelle (17 donneurs, 62 800 cellules, 3 ancestries) demeure optimale car elle préserve la résolution cellulaire nécessaire à l'identification des 7 types cellulaires validés, maintient la pureté diagnostique (AD/PD/CTRL sans comorbidités), et garantit la robustesse du pipeline pseudobulk (96 échantillons après filtres statistiques).</w:t>
+        <w:t xml:space="preserve">Les deux alternatives présentaient des limitations rédhibitoires. La stratégie actuelle (17 donneurs, 62 800 cellules, 3 </w:t>
+      </w:r>
+      <w:proofErr w:type="spellStart"/>
+      <w:r>
+        <w:rPr>
+          <w:rFonts w:ascii="Century Gothic" w:hAnsi="Century Gothic"/>
+          <w:color w:val="7030A0"/>
+          <w:sz w:val="18"/>
+        </w:rPr>
+        <w:t>ancestries</w:t>
+      </w:r>
+      <w:proofErr w:type="spellEnd"/>
+      <w:r>
+        <w:rPr>
+          <w:rFonts w:ascii="Century Gothic" w:hAnsi="Century Gothic"/>
+          <w:color w:val="7030A0"/>
+          <w:sz w:val="18"/>
+        </w:rPr>
+        <w:t>) demeure optimale car elle préserve la résolution cellulaire nécessaire à l'identification des 7 types cellulaires validés, maintient la pureté diagnostique (AD/PD/CTRL sans comorbidités), et garantit la robustesse du pipeline pseudobulk (96 échantillons après filtres statistiques).</w:t>
       </w:r>
     </w:p>
     <w:p>
@@ -10940,7 +13244,61 @@
           <w:color w:val="7030A0"/>
           <w:sz w:val="18"/>
         </w:rPr>
-        <w:t>**Perspective prioritaire identifiée** : L'exploration des donneurs PD avec ancestry 'unknown' (18,8% du dataset) constitue la piste la plus prometteuse. Si 2-3 donneurs PD 'unknown' supplémentaires sont identifiables, la cohorte PD atteindrait N=5-6, franchissant le seuil MIN_DONORS_PER_CLUSTER ≥ 5 et validant pleinement l'analyse différentielle PD vs CTRL.</w:t>
+        <w:t xml:space="preserve">**Perspective prioritaire identifiée** : L'exploration des donneurs PD avec </w:t>
+      </w:r>
+      <w:proofErr w:type="spellStart"/>
+      <w:r>
+        <w:rPr>
+          <w:rFonts w:ascii="Century Gothic" w:hAnsi="Century Gothic"/>
+          <w:color w:val="7030A0"/>
+          <w:sz w:val="18"/>
+        </w:rPr>
+        <w:t>ancestry</w:t>
+      </w:r>
+      <w:proofErr w:type="spellEnd"/>
+      <w:r>
+        <w:rPr>
+          <w:rFonts w:ascii="Century Gothic" w:hAnsi="Century Gothic"/>
+          <w:color w:val="7030A0"/>
+          <w:sz w:val="18"/>
+        </w:rPr>
+        <w:t xml:space="preserve"> '</w:t>
+      </w:r>
+      <w:proofErr w:type="spellStart"/>
+      <w:r>
+        <w:rPr>
+          <w:rFonts w:ascii="Century Gothic" w:hAnsi="Century Gothic"/>
+          <w:color w:val="7030A0"/>
+          <w:sz w:val="18"/>
+        </w:rPr>
+        <w:t>unknown</w:t>
+      </w:r>
+      <w:proofErr w:type="spellEnd"/>
+      <w:r>
+        <w:rPr>
+          <w:rFonts w:ascii="Century Gothic" w:hAnsi="Century Gothic"/>
+          <w:color w:val="7030A0"/>
+          <w:sz w:val="18"/>
+        </w:rPr>
+        <w:t>' (18,8% du dataset) constitue la piste la plus prometteuse. Si 2-3 donneurs PD '</w:t>
+      </w:r>
+      <w:proofErr w:type="spellStart"/>
+      <w:r>
+        <w:rPr>
+          <w:rFonts w:ascii="Century Gothic" w:hAnsi="Century Gothic"/>
+          <w:color w:val="7030A0"/>
+          <w:sz w:val="18"/>
+        </w:rPr>
+        <w:t>unknown</w:t>
+      </w:r>
+      <w:proofErr w:type="spellEnd"/>
+      <w:r>
+        <w:rPr>
+          <w:rFonts w:ascii="Century Gothic" w:hAnsi="Century Gothic"/>
+          <w:color w:val="7030A0"/>
+          <w:sz w:val="18"/>
+        </w:rPr>
+        <w:t>' supplémentaires sont identifiables, la cohorte PD atteindrait N=5-6, franchissant le seuil MIN_DONORS_PER_CLUSTER ≥ 5 et validant pleinement l'analyse différentielle PD vs CTRL.</w:t>
       </w:r>
     </w:p>
     <w:p>
@@ -10990,14 +13348,30 @@
       </w:r>
       <w:r>
         <w:br/>
-        <w:t>Nos résultats mettent en évidence des signatures biologiquement cohérentes : une altération vasculaire majeure associée au lncRNA MEG3 (FDR &lt; 0.05) et des tendances inflammatoires microgliales prometteuses. Ces découvertes valident la pertinence de l'approche 'Pseudobulk' pour éviter les faux positifs inhérents au single-cell.</w:t>
+        <w:t xml:space="preserve">Nos résultats mettent en évidence des signatures biologiquement cohérentes : une altération vasculaire majeure associée au </w:t>
+      </w:r>
+      <w:proofErr w:type="spellStart"/>
+      <w:r>
+        <w:t>lncRNA</w:t>
+      </w:r>
+      <w:proofErr w:type="spellEnd"/>
+      <w:r>
+        <w:t xml:space="preserve"> MEG3 (FDR &lt; 0.05) et des tendances inflammatoires microgliales prometteuses. Ces découvertes valident la pertinence de l'approche 'Pseudobulk' pour éviter les faux positifs inhérents au single-cell.</w:t>
       </w:r>
       <w:r>
         <w:br/>
       </w:r>
       <w:r>
         <w:br/>
-        <w:t>Ce projet constitue donc une preuve de concept solide. L'optimisation de la stratégie d'échantillonnage (via subsampling) est désormais la prochaine étape pour transformer ces tendances biologiques en certitudes statistiques généralisables.</w:t>
+        <w:t xml:space="preserve">Ce projet constitue donc une preuve de concept solide. L'optimisation de la stratégie d'échantillonnage (via </w:t>
+      </w:r>
+      <w:proofErr w:type="spellStart"/>
+      <w:r>
+        <w:t>subsampling</w:t>
+      </w:r>
+      <w:proofErr w:type="spellEnd"/>
+      <w:r>
+        <w:t>) est désormais la prochaine étape pour transformer ces tendances biologiques en certitudes statistiques généralisables.</w:t>
       </w:r>
     </w:p>
     <w:p>
@@ -11037,7 +13411,21 @@
         <w:rPr>
           <w:lang w:val="en-US"/>
         </w:rPr>
-        <w:t xml:space="preserve">Lee, D. et al. (2024). Population-scale cross-disorder atlas of the human prefrontal cortex. medRxiv. </w:t>
+        <w:t xml:space="preserve">Lee, D. et al. (2024). Population-scale cross-disorder atlas of the human prefrontal cortex. </w:t>
+      </w:r>
+      <w:proofErr w:type="spellStart"/>
+      <w:r>
+        <w:rPr>
+          <w:lang w:val="en-US"/>
+        </w:rPr>
+        <w:t>medRxiv</w:t>
+      </w:r>
+      <w:proofErr w:type="spellEnd"/>
+      <w:r>
+        <w:rPr>
+          <w:lang w:val="en-US"/>
+        </w:rPr>
+        <w:t xml:space="preserve">. </w:t>
       </w:r>
     </w:p>
     <w:p>
@@ -16106,6 +18494,66 @@
   </w:num>
   <w:num w:numId="28" w16cid:durableId="1450203630">
     <w:abstractNumId w:val="0"/>
+  </w:num>
+  <w:num w:numId="29" w16cid:durableId="1845703586">
+    <w:abstractNumId w:val="23"/>
+    <w:lvlOverride w:ilvl="0">
+      <w:startOverride w:val="1"/>
+    </w:lvlOverride>
+    <w:lvlOverride w:ilvl="1">
+      <w:startOverride w:val="1"/>
+    </w:lvlOverride>
+    <w:lvlOverride w:ilvl="2">
+      <w:startOverride w:val="1"/>
+    </w:lvlOverride>
+    <w:lvlOverride w:ilvl="3">
+      <w:startOverride w:val="1"/>
+    </w:lvlOverride>
+    <w:lvlOverride w:ilvl="4">
+      <w:startOverride w:val="1"/>
+    </w:lvlOverride>
+    <w:lvlOverride w:ilvl="5">
+      <w:startOverride w:val="1"/>
+    </w:lvlOverride>
+    <w:lvlOverride w:ilvl="6">
+      <w:startOverride w:val="1"/>
+    </w:lvlOverride>
+    <w:lvlOverride w:ilvl="7">
+      <w:startOverride w:val="1"/>
+    </w:lvlOverride>
+    <w:lvlOverride w:ilvl="8">
+      <w:startOverride w:val="1"/>
+    </w:lvlOverride>
+  </w:num>
+  <w:num w:numId="30" w16cid:durableId="1024331315">
+    <w:abstractNumId w:val="23"/>
+    <w:lvlOverride w:ilvl="0">
+      <w:startOverride w:val="1"/>
+    </w:lvlOverride>
+    <w:lvlOverride w:ilvl="1">
+      <w:startOverride w:val="1"/>
+    </w:lvlOverride>
+    <w:lvlOverride w:ilvl="2">
+      <w:startOverride w:val="1"/>
+    </w:lvlOverride>
+    <w:lvlOverride w:ilvl="3">
+      <w:startOverride w:val="1"/>
+    </w:lvlOverride>
+    <w:lvlOverride w:ilvl="4">
+      <w:startOverride w:val="1"/>
+    </w:lvlOverride>
+    <w:lvlOverride w:ilvl="5">
+      <w:startOverride w:val="1"/>
+    </w:lvlOverride>
+    <w:lvlOverride w:ilvl="6">
+      <w:startOverride w:val="1"/>
+    </w:lvlOverride>
+    <w:lvlOverride w:ilvl="7">
+      <w:startOverride w:val="1"/>
+    </w:lvlOverride>
+    <w:lvlOverride w:ilvl="8">
+      <w:startOverride w:val="1"/>
+    </w:lvlOverride>
   </w:num>
 </w:numbering>
 </file>
@@ -16595,7 +19043,6 @@
   <w:style w:type="character" w:default="1" w:styleId="Policepardfaut">
     <w:name w:val="Default Paragraph Font"/>
     <w:uiPriority w:val="1"/>
-    <w:semiHidden/>
     <w:unhideWhenUsed/>
   </w:style>
   <w:style w:type="table" w:default="1" w:styleId="TableauNormal">

</xml_diff>